<commit_message>
Simplify wording across mission cards and captions into accessible plain English
Co-authored-by: arena-agent <297053741+arena-agent@users.noreply.github.com>
</commit_message>
<xml_diff>
--- a/docs/books/python-absolute-beginners/edition-01/Python-for-Absolute-Beginners-The-First-Code-Series-Book-1.docx
+++ b/docs/books/python-absolute-beginners/edition-01/Python-for-Absolute-Beginners-The-First-Code-Series-Book-1.docx
@@ -773,7 +773,7 @@
       </w:r>
     </w:p>
     <w:p>
-      <w:hyperlink w:history="1" r:id="rIdm16ugvsojbtj0qiqfybfo">
+      <w:hyperlink w:history="1" r:id="rIdf7kgmj85pfk9jueacc7f_">
         <w:r>
           <w:rPr>
             <w:rStyle w:val="Hyperlink"/>
@@ -791,7 +791,7 @@
       </w:r>
     </w:p>
     <w:p>
-      <w:hyperlink w:history="1" r:id="rIdjwk9pklvxptz-luld40x1">
+      <w:hyperlink w:history="1" r:id="rIdkaook-n2e_kvupnudfqgz">
         <w:r>
           <w:rPr>
             <w:rStyle w:val="Hyperlink"/>
@@ -3140,7 +3140,7 @@
       </w:r>
     </w:p>
     <w:p>
-      <w:hyperlink w:history="1" r:id="rId4ppsmdl98bs5e6kivse-o">
+      <w:hyperlink w:history="1" r:id="rIdmvz-gff4dyyrxb8nn2dlh">
         <w:r>
           <w:rPr>
             <w:rStyle w:val="Hyperlink"/>
@@ -3158,7 +3158,7 @@
       </w:r>
     </w:p>
     <w:p>
-      <w:hyperlink w:history="1" r:id="rIde3ftita8smlgxlnaozbe_">
+      <w:hyperlink w:history="1" r:id="rIdbyborx1taz7_arnrofbfq">
         <w:r>
           <w:rPr>
             <w:rStyle w:val="Hyperlink"/>
@@ -7027,7 +7027,7 @@
       </w:r>
     </w:p>
     <w:p>
-      <w:hyperlink w:history="1" r:id="rIdwu3qy7sveavugiqaxzsbf">
+      <w:hyperlink w:history="1" r:id="rIdareq_8bmzrn6ussv9khyr">
         <w:r>
           <w:rPr>
             <w:rStyle w:val="Hyperlink"/>
@@ -7045,7 +7045,7 @@
       </w:r>
     </w:p>
     <w:p>
-      <w:hyperlink w:history="1" r:id="rIda2lpkw614rayr3kbpegvn">
+      <w:hyperlink w:history="1" r:id="rIdbmse6yrccyhticxa6hvx8">
         <w:r>
           <w:rPr>
             <w:rStyle w:val="Hyperlink"/>
@@ -7063,7 +7063,7 @@
       </w:r>
     </w:p>
     <w:p>
-      <w:hyperlink w:history="1" r:id="rId__xvlxt5ma1jg8mcmmf6q">
+      <w:hyperlink w:history="1" r:id="rId0dfzi8hybn7bw47mfm10g">
         <w:r>
           <w:rPr>
             <w:rStyle w:val="Hyperlink"/>
@@ -9117,7 +9117,7 @@
       </w:r>
     </w:p>
     <w:p>
-      <w:hyperlink w:history="1" r:id="rIdsbh1suuns07-oic2jcur4">
+      <w:hyperlink w:history="1" r:id="rIdtx4h5-tshdpwgztfhhnnl">
         <w:r>
           <w:rPr>
             <w:rStyle w:val="Hyperlink"/>
@@ -9135,7 +9135,7 @@
       </w:r>
     </w:p>
     <w:p>
-      <w:hyperlink w:history="1" r:id="rIddhorytpfdrimltkwhnmho">
+      <w:hyperlink w:history="1" r:id="rIdvgakrsqbdiv6_np3tplsp">
         <w:r>
           <w:rPr>
             <w:rStyle w:val="Hyperlink"/>
@@ -11888,7 +11888,7 @@
       </w:r>
     </w:p>
     <w:p>
-      <w:hyperlink w:history="1" r:id="rIdjfwhqf-gmr84i8eagdzeh">
+      <w:hyperlink w:history="1" r:id="rIdn2aaueiuggge875i7qhzd">
         <w:r>
           <w:rPr>
             <w:rStyle w:val="Hyperlink"/>

</xml_diff>

<commit_message>
Eliminate UI card whitespace gap and simplify Chapter 1 concepts with relatable everyday analogies
Co-authored-by: arena-agent <297053741+arena-agent@users.noreply.github.com>
</commit_message>
<xml_diff>
--- a/docs/books/python-absolute-beginners/edition-01/Python-for-Absolute-Beginners-The-First-Code-Series-Book-1.docx
+++ b/docs/books/python-absolute-beginners/edition-01/Python-for-Absolute-Beginners-The-First-Code-Series-Book-1.docx
@@ -773,7 +773,7 @@
       </w:r>
     </w:p>
     <w:p>
-      <w:hyperlink w:history="1" r:id="rIdf7kgmj85pfk9jueacc7f_">
+      <w:hyperlink w:history="1" r:id="rIdwsx0ea7air6jijnysiw_a">
         <w:r>
           <w:rPr>
             <w:rStyle w:val="Hyperlink"/>
@@ -791,7 +791,7 @@
       </w:r>
     </w:p>
     <w:p>
-      <w:hyperlink w:history="1" r:id="rIdkaook-n2e_kvupnudfqgz">
+      <w:hyperlink w:history="1" r:id="rIdnrevlvfkcw0siilkxsmwi">
         <w:r>
           <w:rPr>
             <w:rStyle w:val="Hyperlink"/>
@@ -3140,7 +3140,7 @@
       </w:r>
     </w:p>
     <w:p>
-      <w:hyperlink w:history="1" r:id="rIdmvz-gff4dyyrxb8nn2dlh">
+      <w:hyperlink w:history="1" r:id="rId2g17k_3juvhw5pbcmfuw4">
         <w:r>
           <w:rPr>
             <w:rStyle w:val="Hyperlink"/>
@@ -3158,7 +3158,7 @@
       </w:r>
     </w:p>
     <w:p>
-      <w:hyperlink w:history="1" r:id="rIdbyborx1taz7_arnrofbfq">
+      <w:hyperlink w:history="1" r:id="rIduu4o8qcrhgpd_ib-3qwvq">
         <w:r>
           <w:rPr>
             <w:rStyle w:val="Hyperlink"/>
@@ -7027,7 +7027,7 @@
       </w:r>
     </w:p>
     <w:p>
-      <w:hyperlink w:history="1" r:id="rIdareq_8bmzrn6ussv9khyr">
+      <w:hyperlink w:history="1" r:id="rIdpf3m8vhym6qfvplcrmtqu">
         <w:r>
           <w:rPr>
             <w:rStyle w:val="Hyperlink"/>
@@ -7045,7 +7045,7 @@
       </w:r>
     </w:p>
     <w:p>
-      <w:hyperlink w:history="1" r:id="rIdbmse6yrccyhticxa6hvx8">
+      <w:hyperlink w:history="1" r:id="rIdzpfit4ndjurbgrnjvfg8u">
         <w:r>
           <w:rPr>
             <w:rStyle w:val="Hyperlink"/>
@@ -7063,7 +7063,7 @@
       </w:r>
     </w:p>
     <w:p>
-      <w:hyperlink w:history="1" r:id="rId0dfzi8hybn7bw47mfm10g">
+      <w:hyperlink w:history="1" r:id="rIdwtmjolawtrrwtgxnqnou2">
         <w:r>
           <w:rPr>
             <w:rStyle w:val="Hyperlink"/>
@@ -9117,7 +9117,7 @@
       </w:r>
     </w:p>
     <w:p>
-      <w:hyperlink w:history="1" r:id="rIdtx4h5-tshdpwgztfhhnnl">
+      <w:hyperlink w:history="1" r:id="rIdomoghqf-bmhl1jb3qxfbg">
         <w:r>
           <w:rPr>
             <w:rStyle w:val="Hyperlink"/>
@@ -9135,7 +9135,7 @@
       </w:r>
     </w:p>
     <w:p>
-      <w:hyperlink w:history="1" r:id="rIdvgakrsqbdiv6_np3tplsp">
+      <w:hyperlink w:history="1" r:id="rId1bdsjoc7iur_gllaar9u_">
         <w:r>
           <w:rPr>
             <w:rStyle w:val="Hyperlink"/>
@@ -11888,7 +11888,7 @@
       </w:r>
     </w:p>
     <w:p>
-      <w:hyperlink w:history="1" r:id="rIdn2aaueiuggge875i7qhzd">
+      <w:hyperlink w:history="1" r:id="rIdmwgy-l2pmlcunrkwvh6w_">
         <w:r>
           <w:rPr>
             <w:rStyle w:val="Hyperlink"/>

</xml_diff>

<commit_message>
Enhance Chapter 1 with chunked code build, USB analogy, eBook-ready wire blueprint, and concrete Testing Pyramid example
Co-authored-by: arena-agent <297053741+arena-agent@users.noreply.github.com>
</commit_message>
<xml_diff>
--- a/docs/books/python-absolute-beginners/edition-01/Python-for-Absolute-Beginners-The-First-Code-Series-Book-1.docx
+++ b/docs/books/python-absolute-beginners/edition-01/Python-for-Absolute-Beginners-The-First-Code-Series-Book-1.docx
@@ -773,7 +773,7 @@
       </w:r>
     </w:p>
     <w:p>
-      <w:hyperlink w:history="1" r:id="rIdwsx0ea7air6jijnysiw_a">
+      <w:hyperlink w:history="1" r:id="rIdhhrfupqipbbet_br9c8sz">
         <w:r>
           <w:rPr>
             <w:rStyle w:val="Hyperlink"/>
@@ -791,7 +791,7 @@
       </w:r>
     </w:p>
     <w:p>
-      <w:hyperlink w:history="1" r:id="rIdnrevlvfkcw0siilkxsmwi">
+      <w:hyperlink w:history="1" r:id="rIdgmrgks5bpmjmk4j4ricuk">
         <w:r>
           <w:rPr>
             <w:rStyle w:val="Hyperlink"/>
@@ -3140,7 +3140,7 @@
       </w:r>
     </w:p>
     <w:p>
-      <w:hyperlink w:history="1" r:id="rId2g17k_3juvhw5pbcmfuw4">
+      <w:hyperlink w:history="1" r:id="rIdrvd62ds54oncwdftwwpeb">
         <w:r>
           <w:rPr>
             <w:rStyle w:val="Hyperlink"/>
@@ -3158,7 +3158,7 @@
       </w:r>
     </w:p>
     <w:p>
-      <w:hyperlink w:history="1" r:id="rIduu4o8qcrhgpd_ib-3qwvq">
+      <w:hyperlink w:history="1" r:id="rIdrcglegttlgdgwumbqre6f">
         <w:r>
           <w:rPr>
             <w:rStyle w:val="Hyperlink"/>
@@ -7027,7 +7027,7 @@
       </w:r>
     </w:p>
     <w:p>
-      <w:hyperlink w:history="1" r:id="rIdpf3m8vhym6qfvplcrmtqu">
+      <w:hyperlink w:history="1" r:id="rIdw5yozpoyzeni8yycsoxnd">
         <w:r>
           <w:rPr>
             <w:rStyle w:val="Hyperlink"/>
@@ -7045,7 +7045,7 @@
       </w:r>
     </w:p>
     <w:p>
-      <w:hyperlink w:history="1" r:id="rIdzpfit4ndjurbgrnjvfg8u">
+      <w:hyperlink w:history="1" r:id="rIdkrtx5c6pmwrqse7ttuneg">
         <w:r>
           <w:rPr>
             <w:rStyle w:val="Hyperlink"/>
@@ -7063,7 +7063,7 @@
       </w:r>
     </w:p>
     <w:p>
-      <w:hyperlink w:history="1" r:id="rIdwtmjolawtrrwtgxnqnou2">
+      <w:hyperlink w:history="1" r:id="rIdoglsbfu01mwckf-7t1n3o">
         <w:r>
           <w:rPr>
             <w:rStyle w:val="Hyperlink"/>
@@ -9117,7 +9117,7 @@
       </w:r>
     </w:p>
     <w:p>
-      <w:hyperlink w:history="1" r:id="rIdomoghqf-bmhl1jb3qxfbg">
+      <w:hyperlink w:history="1" r:id="rIdmi4vjpyweielyhwnujtkv">
         <w:r>
           <w:rPr>
             <w:rStyle w:val="Hyperlink"/>
@@ -9135,7 +9135,7 @@
       </w:r>
     </w:p>
     <w:p>
-      <w:hyperlink w:history="1" r:id="rId1bdsjoc7iur_gllaar9u_">
+      <w:hyperlink w:history="1" r:id="rId_brj5dk0ntjet7em1lhxa">
         <w:r>
           <w:rPr>
             <w:rStyle w:val="Hyperlink"/>
@@ -11888,7 +11888,7 @@
       </w:r>
     </w:p>
     <w:p>
-      <w:hyperlink w:history="1" r:id="rIdmwgy-l2pmlcunrkwvh6w_">
+      <w:hyperlink w:history="1" r:id="rIdcsm1kpppktpwq-0vkajiw">
         <w:r>
           <w:rPr>
             <w:rStyle w:val="Hyperlink"/>

</xml_diff>

<commit_message>
Clarify Mission 1 3-phase battle plan upfront and lock full-width stacked layout for concept cards
Co-authored-by: arena-agent <297053741+arena-agent@users.noreply.github.com>
</commit_message>
<xml_diff>
--- a/docs/books/python-absolute-beginners/edition-01/Python-for-Absolute-Beginners-The-First-Code-Series-Book-1.docx
+++ b/docs/books/python-absolute-beginners/edition-01/Python-for-Absolute-Beginners-The-First-Code-Series-Book-1.docx
@@ -773,7 +773,7 @@
       </w:r>
     </w:p>
     <w:p>
-      <w:hyperlink w:history="1" r:id="rIdhhrfupqipbbet_br9c8sz">
+      <w:hyperlink w:history="1" r:id="rIdilbzhbd4-mdytlt_7tm6r">
         <w:r>
           <w:rPr>
             <w:rStyle w:val="Hyperlink"/>
@@ -791,7 +791,7 @@
       </w:r>
     </w:p>
     <w:p>
-      <w:hyperlink w:history="1" r:id="rIdgmrgks5bpmjmk4j4ricuk">
+      <w:hyperlink w:history="1" r:id="rIdr8ultxizadugzfirgrblx">
         <w:r>
           <w:rPr>
             <w:rStyle w:val="Hyperlink"/>
@@ -3140,7 +3140,7 @@
       </w:r>
     </w:p>
     <w:p>
-      <w:hyperlink w:history="1" r:id="rIdrvd62ds54oncwdftwwpeb">
+      <w:hyperlink w:history="1" r:id="rIdvjni46kelfktytlh75hv8">
         <w:r>
           <w:rPr>
             <w:rStyle w:val="Hyperlink"/>
@@ -3158,7 +3158,7 @@
       </w:r>
     </w:p>
     <w:p>
-      <w:hyperlink w:history="1" r:id="rIdrcglegttlgdgwumbqre6f">
+      <w:hyperlink w:history="1" r:id="rIdfq5tbfqrtabmtcxrgq9uv">
         <w:r>
           <w:rPr>
             <w:rStyle w:val="Hyperlink"/>
@@ -7027,7 +7027,7 @@
       </w:r>
     </w:p>
     <w:p>
-      <w:hyperlink w:history="1" r:id="rIdw5yozpoyzeni8yycsoxnd">
+      <w:hyperlink w:history="1" r:id="rIdgu-pnqhsaohlpxg4zmoky">
         <w:r>
           <w:rPr>
             <w:rStyle w:val="Hyperlink"/>
@@ -7045,7 +7045,7 @@
       </w:r>
     </w:p>
     <w:p>
-      <w:hyperlink w:history="1" r:id="rIdkrtx5c6pmwrqse7ttuneg">
+      <w:hyperlink w:history="1" r:id="rIdqyhtjw1mxftemk61fxkbr">
         <w:r>
           <w:rPr>
             <w:rStyle w:val="Hyperlink"/>
@@ -7063,7 +7063,7 @@
       </w:r>
     </w:p>
     <w:p>
-      <w:hyperlink w:history="1" r:id="rIdoglsbfu01mwckf-7t1n3o">
+      <w:hyperlink w:history="1" r:id="rIdunqhgwr2ner03xyoisxrj">
         <w:r>
           <w:rPr>
             <w:rStyle w:val="Hyperlink"/>
@@ -9117,7 +9117,7 @@
       </w:r>
     </w:p>
     <w:p>
-      <w:hyperlink w:history="1" r:id="rIdmi4vjpyweielyhwnujtkv">
+      <w:hyperlink w:history="1" r:id="rIdgjzmf-yrr-bttgd2ce2oe">
         <w:r>
           <w:rPr>
             <w:rStyle w:val="Hyperlink"/>
@@ -9135,7 +9135,7 @@
       </w:r>
     </w:p>
     <w:p>
-      <w:hyperlink w:history="1" r:id="rId_brj5dk0ntjet7em1lhxa">
+      <w:hyperlink w:history="1" r:id="rIdntdyam_x_u0pkx1m48fsw">
         <w:r>
           <w:rPr>
             <w:rStyle w:val="Hyperlink"/>
@@ -11888,7 +11888,7 @@
       </w:r>
     </w:p>
     <w:p>
-      <w:hyperlink w:history="1" r:id="rIdcsm1kpppktpwq-0vkajiw">
+      <w:hyperlink w:history="1" r:id="rIdkhtvrlqc1apgexsqbsddg">
         <w:r>
           <w:rPr>
             <w:rStyle w:val="Hyperlink"/>

</xml_diff>

<commit_message>
feat(api-testing): Silicon Valley Workbench UI, Chaos Mode, Mission HUD, War Room Triage, and real-world Battle Scars
- Added Mission Clearance HUD banner with rank badge and phase progression
- Added interactive War Room Incident Triage mini-challenges with tactical debriefs and traps
- Added War Room Battle Scar case study chronicling Healthcare.gov contract failure
- Upgraded ApiInspector with Silicon Valley dark-mode workbench UI, Chaos Mode toggles (500 Server Crash and Latency Spikes), and Postman pm.* test assertions tab
- Enforced strict Rule 19 zero-hyphen standard across titles, headings, triage options, and callouts
- Validated with npm test (43 snippet assertions and 11 Newman tests passing)
- Built all deliverables (Vite web bundle, single-file HTML, and Word DOCX)

Co-authored-by: arena-agent <297053741+arena-agent@users.noreply.github.com>
</commit_message>
<xml_diff>
--- a/docs/books/python-absolute-beginners/edition-01/Python-for-Absolute-Beginners-The-First-Code-Series-Book-1.docx
+++ b/docs/books/python-absolute-beginners/edition-01/Python-for-Absolute-Beginners-The-First-Code-Series-Book-1.docx
@@ -773,7 +773,7 @@
       </w:r>
     </w:p>
     <w:p>
-      <w:hyperlink w:history="1" r:id="rIdilbzhbd4-mdytlt_7tm6r">
+      <w:hyperlink w:history="1" r:id="rIdjl8ejidnexrdzg3a8idug">
         <w:r>
           <w:rPr>
             <w:rStyle w:val="Hyperlink"/>
@@ -791,7 +791,7 @@
       </w:r>
     </w:p>
     <w:p>
-      <w:hyperlink w:history="1" r:id="rIdr8ultxizadugzfirgrblx">
+      <w:hyperlink w:history="1" r:id="rIde7fgc6lvqwpvl_xynh-5d">
         <w:r>
           <w:rPr>
             <w:rStyle w:val="Hyperlink"/>
@@ -3140,7 +3140,7 @@
       </w:r>
     </w:p>
     <w:p>
-      <w:hyperlink w:history="1" r:id="rIdvjni46kelfktytlh75hv8">
+      <w:hyperlink w:history="1" r:id="rIdtxugeuoh-fyxx1ebo_zyy">
         <w:r>
           <w:rPr>
             <w:rStyle w:val="Hyperlink"/>
@@ -3158,7 +3158,7 @@
       </w:r>
     </w:p>
     <w:p>
-      <w:hyperlink w:history="1" r:id="rIdfq5tbfqrtabmtcxrgq9uv">
+      <w:hyperlink w:history="1" r:id="rIdutm5bdhw4tr3rqfxcg1p4">
         <w:r>
           <w:rPr>
             <w:rStyle w:val="Hyperlink"/>
@@ -7027,7 +7027,7 @@
       </w:r>
     </w:p>
     <w:p>
-      <w:hyperlink w:history="1" r:id="rIdgu-pnqhsaohlpxg4zmoky">
+      <w:hyperlink w:history="1" r:id="rIdrmtp1ycoezviduc8_oha6">
         <w:r>
           <w:rPr>
             <w:rStyle w:val="Hyperlink"/>
@@ -7045,7 +7045,7 @@
       </w:r>
     </w:p>
     <w:p>
-      <w:hyperlink w:history="1" r:id="rIdqyhtjw1mxftemk61fxkbr">
+      <w:hyperlink w:history="1" r:id="rIdkxtpivh10jyhtrf9lqizf">
         <w:r>
           <w:rPr>
             <w:rStyle w:val="Hyperlink"/>
@@ -7063,7 +7063,7 @@
       </w:r>
     </w:p>
     <w:p>
-      <w:hyperlink w:history="1" r:id="rIdunqhgwr2ner03xyoisxrj">
+      <w:hyperlink w:history="1" r:id="rIdr7hs2l72mokobhnnoku_p">
         <w:r>
           <w:rPr>
             <w:rStyle w:val="Hyperlink"/>
@@ -9117,7 +9117,7 @@
       </w:r>
     </w:p>
     <w:p>
-      <w:hyperlink w:history="1" r:id="rIdgjzmf-yrr-bttgd2ce2oe">
+      <w:hyperlink w:history="1" r:id="rIdjtiz6ulwne1kd-ei-napl">
         <w:r>
           <w:rPr>
             <w:rStyle w:val="Hyperlink"/>
@@ -9135,7 +9135,7 @@
       </w:r>
     </w:p>
     <w:p>
-      <w:hyperlink w:history="1" r:id="rIdntdyam_x_u0pkx1m48fsw">
+      <w:hyperlink w:history="1" r:id="rIdcvz4bpy4h7-tph2y34klj">
         <w:r>
           <w:rPr>
             <w:rStyle w:val="Hyperlink"/>
@@ -11888,7 +11888,7 @@
       </w:r>
     </w:p>
     <w:p>
-      <w:hyperlink w:history="1" r:id="rIdkhtvrlqc1apgexsqbsddg">
+      <w:hyperlink w:history="1" r:id="rIdwxqyxtr-mbko9s6e_e8yi">
         <w:r>
           <w:rPr>
             <w:rStyle w:val="Hyperlink"/>

</xml_diff>

<commit_message>
feat(api-testing): expand Mission 1 HUD progression, War Room Triage, and Battle Scars across Chapters 2 and 3
- Added Mission HUD tracking Phase 2 (Investigation) and Phase 3 (Automation)
- Added War Room Battle Scar: Twitter Fail Whale cascading 500/503 breakdown in Chapter 2
- Added War Room Triage: Duplicate payment charge and idempotency keys challenge in Chapter 2
- Added War Room Battle Scar: Public Postman workspace key exposure crisis in Chapter 3
- Added War Room Triage: Leaked administrative master key containment challenge in Chapter 3
- Enforced strict Rule 19 zero-hyphen standard across all new triage scenarios and debriefs
- Validated with npm test (43 snippets, 11 Newman tests passing)
- Rebuilt all artifacts (Vite web bundle, single-file HTML, and Word DOCX)

Co-authored-by: arena-agent <297053741+arena-agent@users.noreply.github.com>
</commit_message>
<xml_diff>
--- a/docs/books/python-absolute-beginners/edition-01/Python-for-Absolute-Beginners-The-First-Code-Series-Book-1.docx
+++ b/docs/books/python-absolute-beginners/edition-01/Python-for-Absolute-Beginners-The-First-Code-Series-Book-1.docx
@@ -773,7 +773,7 @@
       </w:r>
     </w:p>
     <w:p>
-      <w:hyperlink w:history="1" r:id="rIdjl8ejidnexrdzg3a8idug">
+      <w:hyperlink w:history="1" r:id="rIdsiy5m1auuk_uwyvrkckcu">
         <w:r>
           <w:rPr>
             <w:rStyle w:val="Hyperlink"/>
@@ -791,7 +791,7 @@
       </w:r>
     </w:p>
     <w:p>
-      <w:hyperlink w:history="1" r:id="rIde7fgc6lvqwpvl_xynh-5d">
+      <w:hyperlink w:history="1" r:id="rIdi1d0_4o0bp3erdlozxd3v">
         <w:r>
           <w:rPr>
             <w:rStyle w:val="Hyperlink"/>
@@ -3140,7 +3140,7 @@
       </w:r>
     </w:p>
     <w:p>
-      <w:hyperlink w:history="1" r:id="rIdtxugeuoh-fyxx1ebo_zyy">
+      <w:hyperlink w:history="1" r:id="rIdbqohl2vqoyhjmz-rfnfib">
         <w:r>
           <w:rPr>
             <w:rStyle w:val="Hyperlink"/>
@@ -3158,7 +3158,7 @@
       </w:r>
     </w:p>
     <w:p>
-      <w:hyperlink w:history="1" r:id="rIdutm5bdhw4tr3rqfxcg1p4">
+      <w:hyperlink w:history="1" r:id="rIdjgpgu9vmmmadvbouaq89s">
         <w:r>
           <w:rPr>
             <w:rStyle w:val="Hyperlink"/>
@@ -7027,7 +7027,7 @@
       </w:r>
     </w:p>
     <w:p>
-      <w:hyperlink w:history="1" r:id="rIdrmtp1ycoezviduc8_oha6">
+      <w:hyperlink w:history="1" r:id="rIdy_4gqm3mfi6x368ze1xig">
         <w:r>
           <w:rPr>
             <w:rStyle w:val="Hyperlink"/>
@@ -7045,7 +7045,7 @@
       </w:r>
     </w:p>
     <w:p>
-      <w:hyperlink w:history="1" r:id="rIdkxtpivh10jyhtrf9lqizf">
+      <w:hyperlink w:history="1" r:id="rIdcntrojyxuhwwngfw3cjj0">
         <w:r>
           <w:rPr>
             <w:rStyle w:val="Hyperlink"/>
@@ -7063,7 +7063,7 @@
       </w:r>
     </w:p>
     <w:p>
-      <w:hyperlink w:history="1" r:id="rIdr7hs2l72mokobhnnoku_p">
+      <w:hyperlink w:history="1" r:id="rIdk9zmd5g3oni9ns1jzknja">
         <w:r>
           <w:rPr>
             <w:rStyle w:val="Hyperlink"/>
@@ -9117,7 +9117,7 @@
       </w:r>
     </w:p>
     <w:p>
-      <w:hyperlink w:history="1" r:id="rIdjtiz6ulwne1kd-ei-napl">
+      <w:hyperlink w:history="1" r:id="rIdnuh99wukwv_uhlf2xp-xy">
         <w:r>
           <w:rPr>
             <w:rStyle w:val="Hyperlink"/>
@@ -9135,7 +9135,7 @@
       </w:r>
     </w:p>
     <w:p>
-      <w:hyperlink w:history="1" r:id="rIdcvz4bpy4h7-tph2y34klj">
+      <w:hyperlink w:history="1" r:id="rIdwvj3kukd_hypcy_zhtgp_">
         <w:r>
           <w:rPr>
             <w:rStyle w:val="Hyperlink"/>
@@ -11888,7 +11888,7 @@
       </w:r>
     </w:p>
     <w:p>
-      <w:hyperlink w:history="1" r:id="rIdwxqyxtr-mbko9s6e_e8yi">
+      <w:hyperlink w:history="1" r:id="rIdtxwuuana8qzz2bzso9rvr">
         <w:r>
           <w:rPr>
             <w:rStyle w:val="Hyperlink"/>

</xml_diff>

<commit_message>
feat(api-testing): decouple 3-phase battle plan into dedicated tactical roadmap visualization
- Separated high-stakes launch narrative in mission block from approach roadmap
- Created dedicated battle-plan block type with 3-phase responsive grid and outcome highlights
- Enhanced Blocks.jsx and docx exporter to render battle-plan blocks cleanly across web and DOCX
- Maintained 100% Rule 19 zero-hyphen compliance across all text and options
- Validated with npm test (43 snippet assertions and 11 Newman tests passing)
- Built all export deliverables including DOCX and standalone HTML

Co-authored-by: arena-agent <297053741+arena-agent@users.noreply.github.com>
</commit_message>
<xml_diff>
--- a/docs/books/python-absolute-beginners/edition-01/Python-for-Absolute-Beginners-The-First-Code-Series-Book-1.docx
+++ b/docs/books/python-absolute-beginners/edition-01/Python-for-Absolute-Beginners-The-First-Code-Series-Book-1.docx
@@ -773,7 +773,7 @@
       </w:r>
     </w:p>
     <w:p>
-      <w:hyperlink w:history="1" r:id="rIdsiy5m1auuk_uwyvrkckcu">
+      <w:hyperlink w:history="1" r:id="rIdkszoy6ndwm4_2qhifcsqn">
         <w:r>
           <w:rPr>
             <w:rStyle w:val="Hyperlink"/>
@@ -791,7 +791,7 @@
       </w:r>
     </w:p>
     <w:p>
-      <w:hyperlink w:history="1" r:id="rIdi1d0_4o0bp3erdlozxd3v">
+      <w:hyperlink w:history="1" r:id="rIdzdqdbryw4uf3qospdh_cg">
         <w:r>
           <w:rPr>
             <w:rStyle w:val="Hyperlink"/>
@@ -3140,7 +3140,7 @@
       </w:r>
     </w:p>
     <w:p>
-      <w:hyperlink w:history="1" r:id="rIdbqohl2vqoyhjmz-rfnfib">
+      <w:hyperlink w:history="1" r:id="rId0bdrvfd-pfwn5gkb_iorx">
         <w:r>
           <w:rPr>
             <w:rStyle w:val="Hyperlink"/>
@@ -3158,7 +3158,7 @@
       </w:r>
     </w:p>
     <w:p>
-      <w:hyperlink w:history="1" r:id="rIdjgpgu9vmmmadvbouaq89s">
+      <w:hyperlink w:history="1" r:id="rIdsrrwj64om9fnsrfncdux1">
         <w:r>
           <w:rPr>
             <w:rStyle w:val="Hyperlink"/>
@@ -7027,7 +7027,7 @@
       </w:r>
     </w:p>
     <w:p>
-      <w:hyperlink w:history="1" r:id="rIdy_4gqm3mfi6x368ze1xig">
+      <w:hyperlink w:history="1" r:id="rIdo2oafxtqdqtk9qdaf-ocm">
         <w:r>
           <w:rPr>
             <w:rStyle w:val="Hyperlink"/>
@@ -7045,7 +7045,7 @@
       </w:r>
     </w:p>
     <w:p>
-      <w:hyperlink w:history="1" r:id="rIdcntrojyxuhwwngfw3cjj0">
+      <w:hyperlink w:history="1" r:id="rId9iqp2ut5fbb5y6xmqc5ws">
         <w:r>
           <w:rPr>
             <w:rStyle w:val="Hyperlink"/>
@@ -7063,7 +7063,7 @@
       </w:r>
     </w:p>
     <w:p>
-      <w:hyperlink w:history="1" r:id="rIdk9zmd5g3oni9ns1jzknja">
+      <w:hyperlink w:history="1" r:id="rIdljulkaooqqik17zprry9h">
         <w:r>
           <w:rPr>
             <w:rStyle w:val="Hyperlink"/>
@@ -9117,7 +9117,7 @@
       </w:r>
     </w:p>
     <w:p>
-      <w:hyperlink w:history="1" r:id="rIdnuh99wukwv_uhlf2xp-xy">
+      <w:hyperlink w:history="1" r:id="rIdtgskeoiqsdmf2n8qqqvh6">
         <w:r>
           <w:rPr>
             <w:rStyle w:val="Hyperlink"/>
@@ -9135,7 +9135,7 @@
       </w:r>
     </w:p>
     <w:p>
-      <w:hyperlink w:history="1" r:id="rIdwvj3kukd_hypcy_zhtgp_">
+      <w:hyperlink w:history="1" r:id="rIdp4oa_jd3p4rep2hmhyfrx">
         <w:r>
           <w:rPr>
             <w:rStyle w:val="Hyperlink"/>
@@ -11888,7 +11888,7 @@
       </w:r>
     </w:p>
     <w:p>
-      <w:hyperlink w:history="1" r:id="rIdtxwuuana8qzz2bzso9rvr">
+      <w:hyperlink w:history="1" r:id="rIdmbk7hphcw6ggejhiklkql">
         <w:r>
           <w:rPr>
             <w:rStyle w:val="Hyperlink"/>

</xml_diff>

<commit_message>
feat(api-testing): visual scenario cards, deconstructed Step 4 architecture pillars, and real public URL mirror
- Transformed weather and flight aggregator examples into visual dual-card ScenarioGrid component
- Eliminated redundant USB cable analogy to streamline narrative velocity
- Restructured Step 4 with StructuredBreakdown pillars (Data Format, Service Identity, Door Route, Handler Logic)
- Resolved private intranet URL confusion in ApiInspector with DNS notice badge, explanatory callout, and clickable Live Browser Link to real public JSON
- Validated with npm test (43 snippets, 11 Newman tests passing)
- Rebuilt all artifacts (Vite web bundle, single-file HTML, and Word DOCX)

Co-authored-by: arena-agent <297053741+arena-agent@users.noreply.github.com>
</commit_message>
<xml_diff>
--- a/docs/books/python-absolute-beginners/edition-01/Python-for-Absolute-Beginners-The-First-Code-Series-Book-1.docx
+++ b/docs/books/python-absolute-beginners/edition-01/Python-for-Absolute-Beginners-The-First-Code-Series-Book-1.docx
@@ -773,7 +773,7 @@
       </w:r>
     </w:p>
     <w:p>
-      <w:hyperlink w:history="1" r:id="rIdkszoy6ndwm4_2qhifcsqn">
+      <w:hyperlink w:history="1" r:id="rIdiwoadp14sjipxsmsq4uzt">
         <w:r>
           <w:rPr>
             <w:rStyle w:val="Hyperlink"/>
@@ -791,7 +791,7 @@
       </w:r>
     </w:p>
     <w:p>
-      <w:hyperlink w:history="1" r:id="rIdzdqdbryw4uf3qospdh_cg">
+      <w:hyperlink w:history="1" r:id="rId4mgwicrnq7k01sbzqajnz">
         <w:r>
           <w:rPr>
             <w:rStyle w:val="Hyperlink"/>
@@ -3140,7 +3140,7 @@
       </w:r>
     </w:p>
     <w:p>
-      <w:hyperlink w:history="1" r:id="rId0bdrvfd-pfwn5gkb_iorx">
+      <w:hyperlink w:history="1" r:id="rIdn6pz_m6ra_7hb0f2dn57s">
         <w:r>
           <w:rPr>
             <w:rStyle w:val="Hyperlink"/>
@@ -3158,7 +3158,7 @@
       </w:r>
     </w:p>
     <w:p>
-      <w:hyperlink w:history="1" r:id="rIdsrrwj64om9fnsrfncdux1">
+      <w:hyperlink w:history="1" r:id="rIdzrmr0efytkl_-_1mueysw">
         <w:r>
           <w:rPr>
             <w:rStyle w:val="Hyperlink"/>
@@ -7027,7 +7027,7 @@
       </w:r>
     </w:p>
     <w:p>
-      <w:hyperlink w:history="1" r:id="rIdo2oafxtqdqtk9qdaf-ocm">
+      <w:hyperlink w:history="1" r:id="rId_r9n1lfdrhpjehwayegh8">
         <w:r>
           <w:rPr>
             <w:rStyle w:val="Hyperlink"/>
@@ -7045,7 +7045,7 @@
       </w:r>
     </w:p>
     <w:p>
-      <w:hyperlink w:history="1" r:id="rId9iqp2ut5fbb5y6xmqc5ws">
+      <w:hyperlink w:history="1" r:id="rIdodrwtkxkkyn-rl9azu3nn">
         <w:r>
           <w:rPr>
             <w:rStyle w:val="Hyperlink"/>
@@ -7063,7 +7063,7 @@
       </w:r>
     </w:p>
     <w:p>
-      <w:hyperlink w:history="1" r:id="rIdljulkaooqqik17zprry9h">
+      <w:hyperlink w:history="1" r:id="rIdqhs8dw1x6ehn88lzy0vee">
         <w:r>
           <w:rPr>
             <w:rStyle w:val="Hyperlink"/>
@@ -9117,7 +9117,7 @@
       </w:r>
     </w:p>
     <w:p>
-      <w:hyperlink w:history="1" r:id="rIdtgskeoiqsdmf2n8qqqvh6">
+      <w:hyperlink w:history="1" r:id="rIdhdemmmygoqnj6u88rshqt">
         <w:r>
           <w:rPr>
             <w:rStyle w:val="Hyperlink"/>
@@ -9135,7 +9135,7 @@
       </w:r>
     </w:p>
     <w:p>
-      <w:hyperlink w:history="1" r:id="rIdp4oa_jd3p4rep2hmhyfrx">
+      <w:hyperlink w:history="1" r:id="rIdha875kjcwq9wkakntlcmr">
         <w:r>
           <w:rPr>
             <w:rStyle w:val="Hyperlink"/>
@@ -11888,7 +11888,7 @@
       </w:r>
     </w:p>
     <w:p>
-      <w:hyperlink w:history="1" r:id="rIdmbk7hphcw6ggejhiklkql">
+      <w:hyperlink w:history="1" r:id="rId6dszps5jxpuglmcdybs28">
         <w:r>
           <w:rPr>
             <w:rStyle w:val="Hyperlink"/>

</xml_diff>

<commit_message>
feat(pedagogy): roll out Mission HUD, Battle Plans, War Room Battle Scars, and Triage challenges across all chapters
Co-authored-by: arena-agent <297053741+arena-agent@users.noreply.github.com>
</commit_message>
<xml_diff>
--- a/docs/books/python-absolute-beginners/edition-01/Python-for-Absolute-Beginners-The-First-Code-Series-Book-1.docx
+++ b/docs/books/python-absolute-beginners/edition-01/Python-for-Absolute-Beginners-The-First-Code-Series-Book-1.docx
@@ -773,7 +773,7 @@
       </w:r>
     </w:p>
     <w:p>
-      <w:hyperlink w:history="1" r:id="rIdiwoadp14sjipxsmsq4uzt">
+      <w:hyperlink w:history="1" r:id="rIdpgl-bwuzymho9_qio7jql">
         <w:r>
           <w:rPr>
             <w:rStyle w:val="Hyperlink"/>
@@ -791,7 +791,7 @@
       </w:r>
     </w:p>
     <w:p>
-      <w:hyperlink w:history="1" r:id="rId4mgwicrnq7k01sbzqajnz">
+      <w:hyperlink w:history="1" r:id="rIdqzoaff7lbydpbvod2zict">
         <w:r>
           <w:rPr>
             <w:rStyle w:val="Hyperlink"/>
@@ -3140,7 +3140,7 @@
       </w:r>
     </w:p>
     <w:p>
-      <w:hyperlink w:history="1" r:id="rIdn6pz_m6ra_7hb0f2dn57s">
+      <w:hyperlink w:history="1" r:id="rIdo0p2ckdulkovww2shbun0">
         <w:r>
           <w:rPr>
             <w:rStyle w:val="Hyperlink"/>
@@ -3158,7 +3158,7 @@
       </w:r>
     </w:p>
     <w:p>
-      <w:hyperlink w:history="1" r:id="rIdzrmr0efytkl_-_1mueysw">
+      <w:hyperlink w:history="1" r:id="rId0qf_v3ungawopumo-zuu_">
         <w:r>
           <w:rPr>
             <w:rStyle w:val="Hyperlink"/>
@@ -7027,7 +7027,7 @@
       </w:r>
     </w:p>
     <w:p>
-      <w:hyperlink w:history="1" r:id="rId_r9n1lfdrhpjehwayegh8">
+      <w:hyperlink w:history="1" r:id="rIdjrpctyg6yjmlj1jiuqdis">
         <w:r>
           <w:rPr>
             <w:rStyle w:val="Hyperlink"/>
@@ -7045,7 +7045,7 @@
       </w:r>
     </w:p>
     <w:p>
-      <w:hyperlink w:history="1" r:id="rIdodrwtkxkkyn-rl9azu3nn">
+      <w:hyperlink w:history="1" r:id="rIdgp3uojvutfxpoukupntyd">
         <w:r>
           <w:rPr>
             <w:rStyle w:val="Hyperlink"/>
@@ -7063,7 +7063,7 @@
       </w:r>
     </w:p>
     <w:p>
-      <w:hyperlink w:history="1" r:id="rIdqhs8dw1x6ehn88lzy0vee">
+      <w:hyperlink w:history="1" r:id="rIdkhylq7wuqc_b5svtrjyh0">
         <w:r>
           <w:rPr>
             <w:rStyle w:val="Hyperlink"/>
@@ -9117,7 +9117,7 @@
       </w:r>
     </w:p>
     <w:p>
-      <w:hyperlink w:history="1" r:id="rIdhdemmmygoqnj6u88rshqt">
+      <w:hyperlink w:history="1" r:id="rId2d_fbjiiz4byr68ku0mzn">
         <w:r>
           <w:rPr>
             <w:rStyle w:val="Hyperlink"/>
@@ -9135,7 +9135,7 @@
       </w:r>
     </w:p>
     <w:p>
-      <w:hyperlink w:history="1" r:id="rIdha875kjcwq9wkakntlcmr">
+      <w:hyperlink w:history="1" r:id="rIdekiahbrfbpdv-lnkjc7_1">
         <w:r>
           <w:rPr>
             <w:rStyle w:val="Hyperlink"/>
@@ -11888,7 +11888,7 @@
       </w:r>
     </w:p>
     <w:p>
-      <w:hyperlink w:history="1" r:id="rId6dszps5jxpuglmcdybs28">
+      <w:hyperlink w:history="1" r:id="rId71xrsuv14ewbif619xd9h">
         <w:r>
           <w:rPr>
             <w:rStyle w:val="Hyperlink"/>

</xml_diff>

<commit_message>
feat(pedagogy): overhaul Foundations, Manual Wire Investigation, and Automation pipeline with chunked code and output prediction
Co-authored-by: arena-agent <297053741+arena-agent@users.noreply.github.com>
</commit_message>
<xml_diff>
--- a/docs/books/python-absolute-beginners/edition-01/Python-for-Absolute-Beginners-The-First-Code-Series-Book-1.docx
+++ b/docs/books/python-absolute-beginners/edition-01/Python-for-Absolute-Beginners-The-First-Code-Series-Book-1.docx
@@ -773,7 +773,7 @@
       </w:r>
     </w:p>
     <w:p>
-      <w:hyperlink w:history="1" r:id="rIdpgl-bwuzymho9_qio7jql">
+      <w:hyperlink w:history="1" r:id="rIdu57jl0vgymgn8wyobal5u">
         <w:r>
           <w:rPr>
             <w:rStyle w:val="Hyperlink"/>
@@ -791,7 +791,7 @@
       </w:r>
     </w:p>
     <w:p>
-      <w:hyperlink w:history="1" r:id="rIdqzoaff7lbydpbvod2zict">
+      <w:hyperlink w:history="1" r:id="rIdy8ybqqd9ogdbgeg0z7tyy">
         <w:r>
           <w:rPr>
             <w:rStyle w:val="Hyperlink"/>
@@ -3140,7 +3140,7 @@
       </w:r>
     </w:p>
     <w:p>
-      <w:hyperlink w:history="1" r:id="rIdo0p2ckdulkovww2shbun0">
+      <w:hyperlink w:history="1" r:id="rId0smpdqpop4j_x798pgoun">
         <w:r>
           <w:rPr>
             <w:rStyle w:val="Hyperlink"/>
@@ -3158,7 +3158,7 @@
       </w:r>
     </w:p>
     <w:p>
-      <w:hyperlink w:history="1" r:id="rId0qf_v3ungawopumo-zuu_">
+      <w:hyperlink w:history="1" r:id="rIdz37b5tm5rxraz1oapyy-m">
         <w:r>
           <w:rPr>
             <w:rStyle w:val="Hyperlink"/>
@@ -7027,7 +7027,7 @@
       </w:r>
     </w:p>
     <w:p>
-      <w:hyperlink w:history="1" r:id="rIdjrpctyg6yjmlj1jiuqdis">
+      <w:hyperlink w:history="1" r:id="rIdcmxlrumapzzu_zv4tvccu">
         <w:r>
           <w:rPr>
             <w:rStyle w:val="Hyperlink"/>
@@ -7045,7 +7045,7 @@
       </w:r>
     </w:p>
     <w:p>
-      <w:hyperlink w:history="1" r:id="rIdgp3uojvutfxpoukupntyd">
+      <w:hyperlink w:history="1" r:id="rIdt0xo3vxxvbm5h4ysvarjn">
         <w:r>
           <w:rPr>
             <w:rStyle w:val="Hyperlink"/>
@@ -7063,7 +7063,7 @@
       </w:r>
     </w:p>
     <w:p>
-      <w:hyperlink w:history="1" r:id="rIdkhylq7wuqc_b5svtrjyh0">
+      <w:hyperlink w:history="1" r:id="rIdmfwk2rmgjyo112xdha7sl">
         <w:r>
           <w:rPr>
             <w:rStyle w:val="Hyperlink"/>
@@ -9117,7 +9117,7 @@
       </w:r>
     </w:p>
     <w:p>
-      <w:hyperlink w:history="1" r:id="rId2d_fbjiiz4byr68ku0mzn">
+      <w:hyperlink w:history="1" r:id="rIdufg9yhgqlrubz35ktj6lk">
         <w:r>
           <w:rPr>
             <w:rStyle w:val="Hyperlink"/>
@@ -9135,7 +9135,7 @@
       </w:r>
     </w:p>
     <w:p>
-      <w:hyperlink w:history="1" r:id="rIdekiahbrfbpdv-lnkjc7_1">
+      <w:hyperlink w:history="1" r:id="rIdipfnn5fyfmkhrjww6nnrt">
         <w:r>
           <w:rPr>
             <w:rStyle w:val="Hyperlink"/>
@@ -11888,7 +11888,7 @@
       </w:r>
     </w:p>
     <w:p>
-      <w:hyperlink w:history="1" r:id="rId71xrsuv14ewbif619xd9h">
+      <w:hyperlink w:history="1" r:id="rId-b6ymmmzg7jhhrja4su9e">
         <w:r>
           <w:rPr>
             <w:rStyle w:val="Hyperlink"/>

</xml_diff>

<commit_message>
feat(pedagogy): complete gap analysis and rollout of chunked code and predictive output across all chapters
Co-authored-by: arena-agent <297053741+arena-agent@users.noreply.github.com>
</commit_message>
<xml_diff>
--- a/docs/books/python-absolute-beginners/edition-01/Python-for-Absolute-Beginners-The-First-Code-Series-Book-1.docx
+++ b/docs/books/python-absolute-beginners/edition-01/Python-for-Absolute-Beginners-The-First-Code-Series-Book-1.docx
@@ -773,7 +773,7 @@
       </w:r>
     </w:p>
     <w:p>
-      <w:hyperlink w:history="1" r:id="rIdu57jl0vgymgn8wyobal5u">
+      <w:hyperlink w:history="1" r:id="rIdjekgnpu96xouzbuc-i7jk">
         <w:r>
           <w:rPr>
             <w:rStyle w:val="Hyperlink"/>
@@ -791,7 +791,7 @@
       </w:r>
     </w:p>
     <w:p>
-      <w:hyperlink w:history="1" r:id="rIdy8ybqqd9ogdbgeg0z7tyy">
+      <w:hyperlink w:history="1" r:id="rIdpcuqctvwe27d5e42aa2xb">
         <w:r>
           <w:rPr>
             <w:rStyle w:val="Hyperlink"/>
@@ -3140,7 +3140,7 @@
       </w:r>
     </w:p>
     <w:p>
-      <w:hyperlink w:history="1" r:id="rId0smpdqpop4j_x798pgoun">
+      <w:hyperlink w:history="1" r:id="rIdr9qeajhsk0e2k3nkcrf8v">
         <w:r>
           <w:rPr>
             <w:rStyle w:val="Hyperlink"/>
@@ -3158,7 +3158,7 @@
       </w:r>
     </w:p>
     <w:p>
-      <w:hyperlink w:history="1" r:id="rIdz37b5tm5rxraz1oapyy-m">
+      <w:hyperlink w:history="1" r:id="rIdj1whp0m37af7i76hj4lsa">
         <w:r>
           <w:rPr>
             <w:rStyle w:val="Hyperlink"/>
@@ -7027,7 +7027,7 @@
       </w:r>
     </w:p>
     <w:p>
-      <w:hyperlink w:history="1" r:id="rIdcmxlrumapzzu_zv4tvccu">
+      <w:hyperlink w:history="1" r:id="rId2ro07pa6ofppfywejfqrh">
         <w:r>
           <w:rPr>
             <w:rStyle w:val="Hyperlink"/>
@@ -7045,7 +7045,7 @@
       </w:r>
     </w:p>
     <w:p>
-      <w:hyperlink w:history="1" r:id="rIdt0xo3vxxvbm5h4ysvarjn">
+      <w:hyperlink w:history="1" r:id="rIdl3mdehpynkl5o7aoq856_">
         <w:r>
           <w:rPr>
             <w:rStyle w:val="Hyperlink"/>
@@ -7063,7 +7063,7 @@
       </w:r>
     </w:p>
     <w:p>
-      <w:hyperlink w:history="1" r:id="rIdmfwk2rmgjyo112xdha7sl">
+      <w:hyperlink w:history="1" r:id="rIdyv1eknplmdszysjroglja">
         <w:r>
           <w:rPr>
             <w:rStyle w:val="Hyperlink"/>
@@ -9117,7 +9117,7 @@
       </w:r>
     </w:p>
     <w:p>
-      <w:hyperlink w:history="1" r:id="rIdufg9yhgqlrubz35ktj6lk">
+      <w:hyperlink w:history="1" r:id="rIdsbfahwob0hs3kn3u-ehql">
         <w:r>
           <w:rPr>
             <w:rStyle w:val="Hyperlink"/>
@@ -9135,7 +9135,7 @@
       </w:r>
     </w:p>
     <w:p>
-      <w:hyperlink w:history="1" r:id="rIdipfnn5fyfmkhrjww6nnrt">
+      <w:hyperlink w:history="1" r:id="rIdkiuxge4vmsaabwpqqc343">
         <w:r>
           <w:rPr>
             <w:rStyle w:val="Hyperlink"/>
@@ -11888,7 +11888,7 @@
       </w:r>
     </w:p>
     <w:p>
-      <w:hyperlink w:history="1" r:id="rId-b6ymmmzg7jhhrja4su9e">
+      <w:hyperlink w:history="1" r:id="rIdidpt6jxmtj4etpkub2u1j">
         <w:r>
           <w:rPr>
             <w:rStyle w:val="Hyperlink"/>
@@ -11947,15 +11947,15 @@
                 <w:bCs/>
                 <w:color w:val="263A67"/>
               </w:rPr>
-              <w:t xml:space="preserve">NEXT DISCOVERY · How does a reader give us a value?</w:t>
-            </w:r>
-          </w:p>
-          <w:p>
-            <w:pPr>
-              <w:spacing w:after="120" w:line="300"/>
-            </w:pPr>
-            <w:r>
-              <w:t xml:space="preserve">Next, we use input() and learn why typed input begins as a string.</w:t>
+              <w:t xml:space="preserve">NEXT DISCOVERY · The Next Coding Frontier</w:t>
+            </w:r>
+          </w:p>
+          <w:p>
+            <w:pPr>
+              <w:spacing w:after="120" w:line="300"/>
+            </w:pPr>
+            <w:r>
+              <w:t xml:space="preserve">Our First Code Series continues in future editions: mastering user input with input(), conditional branching, loop iterations, and object hierarchies!</w:t>
             </w:r>
           </w:p>
         </w:tc>

</xml_diff>

<commit_message>
Calibrate transit bug explanation, dual assertions, interactive library workbench, and curriculum blueprint
Co-authored-by: arena-agent <297053741+arena-agent@users.noreply.github.com>
</commit_message>
<xml_diff>
--- a/docs/books/python-absolute-beginners/edition-01/Python-for-Absolute-Beginners-The-First-Code-Series-Book-1.docx
+++ b/docs/books/python-absolute-beginners/edition-01/Python-for-Absolute-Beginners-The-First-Code-Series-Book-1.docx
@@ -773,7 +773,7 @@
       </w:r>
     </w:p>
     <w:p>
-      <w:hyperlink w:history="1" r:id="rIdjekgnpu96xouzbuc-i7jk">
+      <w:hyperlink w:history="1" r:id="rId0ybscsmrcr35rmz5g__jv">
         <w:r>
           <w:rPr>
             <w:rStyle w:val="Hyperlink"/>
@@ -791,7 +791,7 @@
       </w:r>
     </w:p>
     <w:p>
-      <w:hyperlink w:history="1" r:id="rIdpcuqctvwe27d5e42aa2xb">
+      <w:hyperlink w:history="1" r:id="rIdnkjo56l7a7ymwhl8y7ixo">
         <w:r>
           <w:rPr>
             <w:rStyle w:val="Hyperlink"/>
@@ -3140,7 +3140,7 @@
       </w:r>
     </w:p>
     <w:p>
-      <w:hyperlink w:history="1" r:id="rIdr9qeajhsk0e2k3nkcrf8v">
+      <w:hyperlink w:history="1" r:id="rIdpai7gbxxe2bh5wlgugbyr">
         <w:r>
           <w:rPr>
             <w:rStyle w:val="Hyperlink"/>
@@ -3158,7 +3158,7 @@
       </w:r>
     </w:p>
     <w:p>
-      <w:hyperlink w:history="1" r:id="rIdj1whp0m37af7i76hj4lsa">
+      <w:hyperlink w:history="1" r:id="rIdx0chqgpsccnd9qr94ulpm">
         <w:r>
           <w:rPr>
             <w:rStyle w:val="Hyperlink"/>
@@ -7027,7 +7027,7 @@
       </w:r>
     </w:p>
     <w:p>
-      <w:hyperlink w:history="1" r:id="rId2ro07pa6ofppfywejfqrh">
+      <w:hyperlink w:history="1" r:id="rIden2id6pqwgxgfqk6iq7gt">
         <w:r>
           <w:rPr>
             <w:rStyle w:val="Hyperlink"/>
@@ -7045,7 +7045,7 @@
       </w:r>
     </w:p>
     <w:p>
-      <w:hyperlink w:history="1" r:id="rIdl3mdehpynkl5o7aoq856_">
+      <w:hyperlink w:history="1" r:id="rIdef762plcxmrwthfin5e9q">
         <w:r>
           <w:rPr>
             <w:rStyle w:val="Hyperlink"/>
@@ -7063,7 +7063,7 @@
       </w:r>
     </w:p>
     <w:p>
-      <w:hyperlink w:history="1" r:id="rIdyv1eknplmdszysjroglja">
+      <w:hyperlink w:history="1" r:id="rIdhkhstrbv4wyflrh_sxujd">
         <w:r>
           <w:rPr>
             <w:rStyle w:val="Hyperlink"/>
@@ -9117,7 +9117,7 @@
       </w:r>
     </w:p>
     <w:p>
-      <w:hyperlink w:history="1" r:id="rIdsbfahwob0hs3kn3u-ehql">
+      <w:hyperlink w:history="1" r:id="rIdmdz4uqjooay0vtpx13sst">
         <w:r>
           <w:rPr>
             <w:rStyle w:val="Hyperlink"/>
@@ -9135,7 +9135,7 @@
       </w:r>
     </w:p>
     <w:p>
-      <w:hyperlink w:history="1" r:id="rIdkiuxge4vmsaabwpqqc343">
+      <w:hyperlink w:history="1" r:id="rIdd0qsckcnrecdoyotsn2lu">
         <w:r>
           <w:rPr>
             <w:rStyle w:val="Hyperlink"/>
@@ -11888,7 +11888,7 @@
       </w:r>
     </w:p>
     <w:p>
-      <w:hyperlink w:history="1" r:id="rIdidpt6jxmtj4etpkub2u1j">
+      <w:hyperlink w:history="1" r:id="rIdtayaqs3ygdxnakxx-mjkt">
         <w:r>
           <w:rPr>
             <w:rStyle w:val="Hyperlink"/>

</xml_diff>

<commit_message>
Showcase developing minimal API server from scratch and step through all operations with code, prediction, and wire capture
Co-authored-by: arena-agent <297053741+arena-agent@users.noreply.github.com>
</commit_message>
<xml_diff>
--- a/docs/books/python-absolute-beginners/edition-01/Python-for-Absolute-Beginners-The-First-Code-Series-Book-1.docx
+++ b/docs/books/python-absolute-beginners/edition-01/Python-for-Absolute-Beginners-The-First-Code-Series-Book-1.docx
@@ -773,7 +773,7 @@
       </w:r>
     </w:p>
     <w:p>
-      <w:hyperlink w:history="1" r:id="rId0ybscsmrcr35rmz5g__jv">
+      <w:hyperlink w:history="1" r:id="rIdwtxrznrjjy-prp49je5e7">
         <w:r>
           <w:rPr>
             <w:rStyle w:val="Hyperlink"/>
@@ -791,7 +791,7 @@
       </w:r>
     </w:p>
     <w:p>
-      <w:hyperlink w:history="1" r:id="rIdnkjo56l7a7ymwhl8y7ixo">
+      <w:hyperlink w:history="1" r:id="rIdcjtu_hjkcekssq45ierkv">
         <w:r>
           <w:rPr>
             <w:rStyle w:val="Hyperlink"/>
@@ -3140,7 +3140,7 @@
       </w:r>
     </w:p>
     <w:p>
-      <w:hyperlink w:history="1" r:id="rIdpai7gbxxe2bh5wlgugbyr">
+      <w:hyperlink w:history="1" r:id="rId6vhwacqrjvg1i7yj5s2ha">
         <w:r>
           <w:rPr>
             <w:rStyle w:val="Hyperlink"/>
@@ -3158,7 +3158,7 @@
       </w:r>
     </w:p>
     <w:p>
-      <w:hyperlink w:history="1" r:id="rIdx0chqgpsccnd9qr94ulpm">
+      <w:hyperlink w:history="1" r:id="rIdc0g9bg0gltblnv9vkho4x">
         <w:r>
           <w:rPr>
             <w:rStyle w:val="Hyperlink"/>
@@ -7027,7 +7027,7 @@
       </w:r>
     </w:p>
     <w:p>
-      <w:hyperlink w:history="1" r:id="rIden2id6pqwgxgfqk6iq7gt">
+      <w:hyperlink w:history="1" r:id="rIdpu0tkqkena_-rpraetotq">
         <w:r>
           <w:rPr>
             <w:rStyle w:val="Hyperlink"/>
@@ -7045,7 +7045,7 @@
       </w:r>
     </w:p>
     <w:p>
-      <w:hyperlink w:history="1" r:id="rIdef762plcxmrwthfin5e9q">
+      <w:hyperlink w:history="1" r:id="rIdgp41yplmnhruob9uegjv8">
         <w:r>
           <w:rPr>
             <w:rStyle w:val="Hyperlink"/>
@@ -7063,7 +7063,7 @@
       </w:r>
     </w:p>
     <w:p>
-      <w:hyperlink w:history="1" r:id="rIdhkhstrbv4wyflrh_sxujd">
+      <w:hyperlink w:history="1" r:id="rIdx_li8tkq6sqifo_i0y8lc">
         <w:r>
           <w:rPr>
             <w:rStyle w:val="Hyperlink"/>
@@ -9117,7 +9117,7 @@
       </w:r>
     </w:p>
     <w:p>
-      <w:hyperlink w:history="1" r:id="rIdmdz4uqjooay0vtpx13sst">
+      <w:hyperlink w:history="1" r:id="rIdls36b00hbrtuf6acx5b3q">
         <w:r>
           <w:rPr>
             <w:rStyle w:val="Hyperlink"/>
@@ -9135,7 +9135,7 @@
       </w:r>
     </w:p>
     <w:p>
-      <w:hyperlink w:history="1" r:id="rIdd0qsckcnrecdoyotsn2lu">
+      <w:hyperlink w:history="1" r:id="rIdajcq5ky-czkrsylegotux">
         <w:r>
           <w:rPr>
             <w:rStyle w:val="Hyperlink"/>
@@ -11888,7 +11888,7 @@
       </w:r>
     </w:p>
     <w:p>
-      <w:hyperlink w:history="1" r:id="rIdtayaqs3ygdxnakxx-mjkt">
+      <w:hyperlink w:history="1" r:id="rIdlwh5z_ivs5u6qsu-n7wfp">
         <w:r>
           <w:rPr>
             <w:rStyle w:val="Hyperlink"/>

</xml_diff>

<commit_message>
feat: complete pedagogical continuity audit across Chapters 1-13 and master publishing suite
Co-authored-by: arena-agent <297053741+arena-agent@users.noreply.github.com>
</commit_message>
<xml_diff>
--- a/docs/books/python-absolute-beginners/edition-01/Python-for-Absolute-Beginners-The-First-Code-Series-Book-1.docx
+++ b/docs/books/python-absolute-beginners/edition-01/Python-for-Absolute-Beginners-The-First-Code-Series-Book-1.docx
@@ -773,7 +773,7 @@
       </w:r>
     </w:p>
     <w:p>
-      <w:hyperlink w:history="1" r:id="rIdwtxrznrjjy-prp49je5e7">
+      <w:hyperlink w:history="1" r:id="rIdsl1mubu280rcqgizyzvrm">
         <w:r>
           <w:rPr>
             <w:rStyle w:val="Hyperlink"/>
@@ -791,7 +791,7 @@
       </w:r>
     </w:p>
     <w:p>
-      <w:hyperlink w:history="1" r:id="rIdcjtu_hjkcekssq45ierkv">
+      <w:hyperlink w:history="1" r:id="rIddrfx7yjfigbgux7xtmivk">
         <w:r>
           <w:rPr>
             <w:rStyle w:val="Hyperlink"/>
@@ -3140,7 +3140,7 @@
       </w:r>
     </w:p>
     <w:p>
-      <w:hyperlink w:history="1" r:id="rId6vhwacqrjvg1i7yj5s2ha">
+      <w:hyperlink w:history="1" r:id="rIdgal2d7eifx3ccillhkgiv">
         <w:r>
           <w:rPr>
             <w:rStyle w:val="Hyperlink"/>
@@ -3158,7 +3158,7 @@
       </w:r>
     </w:p>
     <w:p>
-      <w:hyperlink w:history="1" r:id="rIdc0g9bg0gltblnv9vkho4x">
+      <w:hyperlink w:history="1" r:id="rId9p1avsljg4rxxccasabim">
         <w:r>
           <w:rPr>
             <w:rStyle w:val="Hyperlink"/>
@@ -7027,7 +7027,7 @@
       </w:r>
     </w:p>
     <w:p>
-      <w:hyperlink w:history="1" r:id="rIdpu0tkqkena_-rpraetotq">
+      <w:hyperlink w:history="1" r:id="rIdfw_yegnkkui42fubocx0z">
         <w:r>
           <w:rPr>
             <w:rStyle w:val="Hyperlink"/>
@@ -7045,7 +7045,7 @@
       </w:r>
     </w:p>
     <w:p>
-      <w:hyperlink w:history="1" r:id="rIdgp41yplmnhruob9uegjv8">
+      <w:hyperlink w:history="1" r:id="rIdzfhmhflgrfvcoyhbn3nsg">
         <w:r>
           <w:rPr>
             <w:rStyle w:val="Hyperlink"/>
@@ -7063,7 +7063,7 @@
       </w:r>
     </w:p>
     <w:p>
-      <w:hyperlink w:history="1" r:id="rIdx_li8tkq6sqifo_i0y8lc">
+      <w:hyperlink w:history="1" r:id="rId0tz9nzmbahpwhslunjgj9">
         <w:r>
           <w:rPr>
             <w:rStyle w:val="Hyperlink"/>
@@ -9117,7 +9117,7 @@
       </w:r>
     </w:p>
     <w:p>
-      <w:hyperlink w:history="1" r:id="rIdls36b00hbrtuf6acx5b3q">
+      <w:hyperlink w:history="1" r:id="rId8o7w_qjnh_2uvdgaqzxvm">
         <w:r>
           <w:rPr>
             <w:rStyle w:val="Hyperlink"/>
@@ -9135,7 +9135,7 @@
       </w:r>
     </w:p>
     <w:p>
-      <w:hyperlink w:history="1" r:id="rIdajcq5ky-czkrsylegotux">
+      <w:hyperlink w:history="1" r:id="rId_7awiendkdhtuzmxvy2lb">
         <w:r>
           <w:rPr>
             <w:rStyle w:val="Hyperlink"/>
@@ -11888,7 +11888,7 @@
       </w:r>
     </w:p>
     <w:p>
-      <w:hyperlink w:history="1" r:id="rIdlwh5z_ivs5u6qsu-n7wfp">
+      <w:hyperlink w:history="1" r:id="rIdxtiij2cirbbuphojgzeyp">
         <w:r>
           <w:rPr>
             <w:rStyle w:val="Hyperlink"/>

</xml_diff>

<commit_message>
chore: synchronize predev generated release artifacts
Co-authored-by: arena-agent <297053741+arena-agent@users.noreply.github.com>
</commit_message>
<xml_diff>
--- a/docs/books/python-absolute-beginners/edition-01/Python-for-Absolute-Beginners-The-First-Code-Series-Book-1.docx
+++ b/docs/books/python-absolute-beginners/edition-01/Python-for-Absolute-Beginners-The-First-Code-Series-Book-1.docx
@@ -773,7 +773,7 @@
       </w:r>
     </w:p>
     <w:p>
-      <w:hyperlink w:history="1" r:id="rIdsl1mubu280rcqgizyzvrm">
+      <w:hyperlink w:history="1" r:id="rId70_uzxvkp08fbxkfsfpxv">
         <w:r>
           <w:rPr>
             <w:rStyle w:val="Hyperlink"/>
@@ -791,7 +791,7 @@
       </w:r>
     </w:p>
     <w:p>
-      <w:hyperlink w:history="1" r:id="rIddrfx7yjfigbgux7xtmivk">
+      <w:hyperlink w:history="1" r:id="rIdj2l9tg52dymeldkdlqgrh">
         <w:r>
           <w:rPr>
             <w:rStyle w:val="Hyperlink"/>
@@ -3140,7 +3140,7 @@
       </w:r>
     </w:p>
     <w:p>
-      <w:hyperlink w:history="1" r:id="rIdgal2d7eifx3ccillhkgiv">
+      <w:hyperlink w:history="1" r:id="rIdubyptd-37iy2rq4g-ajqe">
         <w:r>
           <w:rPr>
             <w:rStyle w:val="Hyperlink"/>
@@ -3158,7 +3158,7 @@
       </w:r>
     </w:p>
     <w:p>
-      <w:hyperlink w:history="1" r:id="rId9p1avsljg4rxxccasabim">
+      <w:hyperlink w:history="1" r:id="rIdn1ydus9noeyqp4nsywgor">
         <w:r>
           <w:rPr>
             <w:rStyle w:val="Hyperlink"/>
@@ -7027,7 +7027,7 @@
       </w:r>
     </w:p>
     <w:p>
-      <w:hyperlink w:history="1" r:id="rIdfw_yegnkkui42fubocx0z">
+      <w:hyperlink w:history="1" r:id="rIdea6y_lysmgtg7z04cfddt">
         <w:r>
           <w:rPr>
             <w:rStyle w:val="Hyperlink"/>
@@ -7045,7 +7045,7 @@
       </w:r>
     </w:p>
     <w:p>
-      <w:hyperlink w:history="1" r:id="rIdzfhmhflgrfvcoyhbn3nsg">
+      <w:hyperlink w:history="1" r:id="rIdwnpnlhea6ykkt9v8io3uk">
         <w:r>
           <w:rPr>
             <w:rStyle w:val="Hyperlink"/>
@@ -7063,7 +7063,7 @@
       </w:r>
     </w:p>
     <w:p>
-      <w:hyperlink w:history="1" r:id="rId0tz9nzmbahpwhslunjgj9">
+      <w:hyperlink w:history="1" r:id="rIdhv3jpfuhzgxoiafskqh1x">
         <w:r>
           <w:rPr>
             <w:rStyle w:val="Hyperlink"/>
@@ -9117,7 +9117,7 @@
       </w:r>
     </w:p>
     <w:p>
-      <w:hyperlink w:history="1" r:id="rId8o7w_qjnh_2uvdgaqzxvm">
+      <w:hyperlink w:history="1" r:id="rIdan_2r2nzo4ibc-uhbnkit">
         <w:r>
           <w:rPr>
             <w:rStyle w:val="Hyperlink"/>
@@ -9135,7 +9135,7 @@
       </w:r>
     </w:p>
     <w:p>
-      <w:hyperlink w:history="1" r:id="rId_7awiendkdhtuzmxvy2lb">
+      <w:hyperlink w:history="1" r:id="rIdtcfusjlsptp8wakwwhncy">
         <w:r>
           <w:rPr>
             <w:rStyle w:val="Hyperlink"/>
@@ -11888,7 +11888,7 @@
       </w:r>
     </w:p>
     <w:p>
-      <w:hyperlink w:history="1" r:id="rIdxtiij2cirbbuphojgzeyp">
+      <w:hyperlink w:history="1" r:id="rIdlgxov4a8xwm_zd__e5gsn">
         <w:r>
           <w:rPr>
             <w:rStyle w:val="Hyperlink"/>

</xml_diff>

<commit_message>
feat(ch01): re-sequence POST before GET and replace visual assets with publication-grade light mode diagrams
Co-authored-by: arena-agent <297053741+arena-agent@users.noreply.github.com>
</commit_message>
<xml_diff>
--- a/docs/books/python-absolute-beginners/edition-01/Python-for-Absolute-Beginners-The-First-Code-Series-Book-1.docx
+++ b/docs/books/python-absolute-beginners/edition-01/Python-for-Absolute-Beginners-The-First-Code-Series-Book-1.docx
@@ -773,7 +773,7 @@
       </w:r>
     </w:p>
     <w:p>
-      <w:hyperlink w:history="1" r:id="rId70_uzxvkp08fbxkfsfpxv">
+      <w:hyperlink w:history="1" r:id="rId8w7v8ouvq-je6gf2_v9xr">
         <w:r>
           <w:rPr>
             <w:rStyle w:val="Hyperlink"/>
@@ -791,7 +791,7 @@
       </w:r>
     </w:p>
     <w:p>
-      <w:hyperlink w:history="1" r:id="rIdj2l9tg52dymeldkdlqgrh">
+      <w:hyperlink w:history="1" r:id="rIdcxchc54wt_hzyjnjq3yts">
         <w:r>
           <w:rPr>
             <w:rStyle w:val="Hyperlink"/>
@@ -3140,7 +3140,7 @@
       </w:r>
     </w:p>
     <w:p>
-      <w:hyperlink w:history="1" r:id="rIdubyptd-37iy2rq4g-ajqe">
+      <w:hyperlink w:history="1" r:id="rIdurbmifxtr1ulxhwpuonop">
         <w:r>
           <w:rPr>
             <w:rStyle w:val="Hyperlink"/>
@@ -3158,7 +3158,7 @@
       </w:r>
     </w:p>
     <w:p>
-      <w:hyperlink w:history="1" r:id="rIdn1ydus9noeyqp4nsywgor">
+      <w:hyperlink w:history="1" r:id="rIdifo0giwmi-y8zv_du-vx3">
         <w:r>
           <w:rPr>
             <w:rStyle w:val="Hyperlink"/>
@@ -7027,7 +7027,7 @@
       </w:r>
     </w:p>
     <w:p>
-      <w:hyperlink w:history="1" r:id="rIdea6y_lysmgtg7z04cfddt">
+      <w:hyperlink w:history="1" r:id="rIdjxlyloendqrtintcco9wj">
         <w:r>
           <w:rPr>
             <w:rStyle w:val="Hyperlink"/>
@@ -7045,7 +7045,7 @@
       </w:r>
     </w:p>
     <w:p>
-      <w:hyperlink w:history="1" r:id="rIdwnpnlhea6ykkt9v8io3uk">
+      <w:hyperlink w:history="1" r:id="rId9_ckhyhxjx-tl_mkkxunp">
         <w:r>
           <w:rPr>
             <w:rStyle w:val="Hyperlink"/>
@@ -7063,7 +7063,7 @@
       </w:r>
     </w:p>
     <w:p>
-      <w:hyperlink w:history="1" r:id="rIdhv3jpfuhzgxoiafskqh1x">
+      <w:hyperlink w:history="1" r:id="rId3zq0oizddnv-1migvx6iz">
         <w:r>
           <w:rPr>
             <w:rStyle w:val="Hyperlink"/>
@@ -9117,7 +9117,7 @@
       </w:r>
     </w:p>
     <w:p>
-      <w:hyperlink w:history="1" r:id="rIdan_2r2nzo4ibc-uhbnkit">
+      <w:hyperlink w:history="1" r:id="rIdaizrp5png4_gd-ni8yqah">
         <w:r>
           <w:rPr>
             <w:rStyle w:val="Hyperlink"/>
@@ -9135,7 +9135,7 @@
       </w:r>
     </w:p>
     <w:p>
-      <w:hyperlink w:history="1" r:id="rIdtcfusjlsptp8wakwwhncy">
+      <w:hyperlink w:history="1" r:id="rIdgoyep5rdsp7toht_klzxx">
         <w:r>
           <w:rPr>
             <w:rStyle w:val="Hyperlink"/>
@@ -11888,7 +11888,7 @@
       </w:r>
     </w:p>
     <w:p>
-      <w:hyperlink w:history="1" r:id="rIdlgxov4a8xwm_zd__e5gsn">
+      <w:hyperlink w:history="1" r:id="rIddiozr41icx9w9sgj7k3dt">
         <w:r>
           <w:rPr>
             <w:rStyle w:val="Hyperlink"/>

</xml_diff>

<commit_message>
feat: add dedicated mission briefing before chapters, preface and how-to-use in web reader, and box-and-subbox server anatomy diagram
Co-authored-by: arena-agent <297053741+arena-agent@users.noreply.github.com>
</commit_message>
<xml_diff>
--- a/docs/books/python-absolute-beginners/edition-01/Python-for-Absolute-Beginners-The-First-Code-Series-Book-1.docx
+++ b/docs/books/python-absolute-beginners/edition-01/Python-for-Absolute-Beginners-The-First-Code-Series-Book-1.docx
@@ -773,7 +773,7 @@
       </w:r>
     </w:p>
     <w:p>
-      <w:hyperlink w:history="1" r:id="rId8w7v8ouvq-je6gf2_v9xr">
+      <w:hyperlink w:history="1" r:id="rIdzjbqntbn9okentv2y_fyb">
         <w:r>
           <w:rPr>
             <w:rStyle w:val="Hyperlink"/>
@@ -791,7 +791,7 @@
       </w:r>
     </w:p>
     <w:p>
-      <w:hyperlink w:history="1" r:id="rIdcxchc54wt_hzyjnjq3yts">
+      <w:hyperlink w:history="1" r:id="rIdu7fpvrbnnkgnicjj6nf3d">
         <w:r>
           <w:rPr>
             <w:rStyle w:val="Hyperlink"/>
@@ -3140,7 +3140,7 @@
       </w:r>
     </w:p>
     <w:p>
-      <w:hyperlink w:history="1" r:id="rIdurbmifxtr1ulxhwpuonop">
+      <w:hyperlink w:history="1" r:id="rId2kgoecb_rpfophdb72drr">
         <w:r>
           <w:rPr>
             <w:rStyle w:val="Hyperlink"/>
@@ -3158,7 +3158,7 @@
       </w:r>
     </w:p>
     <w:p>
-      <w:hyperlink w:history="1" r:id="rIdifo0giwmi-y8zv_du-vx3">
+      <w:hyperlink w:history="1" r:id="rIdgswvstn1fqopcluo0fiht">
         <w:r>
           <w:rPr>
             <w:rStyle w:val="Hyperlink"/>
@@ -7027,7 +7027,7 @@
       </w:r>
     </w:p>
     <w:p>
-      <w:hyperlink w:history="1" r:id="rIdjxlyloendqrtintcco9wj">
+      <w:hyperlink w:history="1" r:id="rIdeq1bqglqhs7vwasedkeeh">
         <w:r>
           <w:rPr>
             <w:rStyle w:val="Hyperlink"/>
@@ -7045,7 +7045,7 @@
       </w:r>
     </w:p>
     <w:p>
-      <w:hyperlink w:history="1" r:id="rId9_ckhyhxjx-tl_mkkxunp">
+      <w:hyperlink w:history="1" r:id="rIdrp2fj1muqraibtqxvt6mq">
         <w:r>
           <w:rPr>
             <w:rStyle w:val="Hyperlink"/>
@@ -7063,7 +7063,7 @@
       </w:r>
     </w:p>
     <w:p>
-      <w:hyperlink w:history="1" r:id="rId3zq0oizddnv-1migvx6iz">
+      <w:hyperlink w:history="1" r:id="rIdrl177y-a9zxn7tdaornbb">
         <w:r>
           <w:rPr>
             <w:rStyle w:val="Hyperlink"/>
@@ -9117,7 +9117,7 @@
       </w:r>
     </w:p>
     <w:p>
-      <w:hyperlink w:history="1" r:id="rIdaizrp5png4_gd-ni8yqah">
+      <w:hyperlink w:history="1" r:id="rIdud0abpw0tefiavnjmabzw">
         <w:r>
           <w:rPr>
             <w:rStyle w:val="Hyperlink"/>
@@ -9135,7 +9135,7 @@
       </w:r>
     </w:p>
     <w:p>
-      <w:hyperlink w:history="1" r:id="rIdgoyep5rdsp7toht_klzxx">
+      <w:hyperlink w:history="1" r:id="rIdfgx8fmvqsjbntsuzmyrmi">
         <w:r>
           <w:rPr>
             <w:rStyle w:val="Hyperlink"/>
@@ -11888,7 +11888,7 @@
       </w:r>
     </w:p>
     <w:p>
-      <w:hyperlink w:history="1" r:id="rIddiozr41icx9w9sgj7k3dt">
+      <w:hyperlink w:history="1" r:id="rIdbpj3kd80naoormss1jfsb">
         <w:r>
           <w:rPr>
             <w:rStyle w:val="Hyperlink"/>

</xml_diff>

<commit_message>
feat(ch01): add Mission 1 scenario card with war room image and clarify 3-phase tactical roadmap in briefing
Co-authored-by: arena-agent <297053741+arena-agent@users.noreply.github.com>
</commit_message>
<xml_diff>
--- a/docs/books/python-absolute-beginners/edition-01/Python-for-Absolute-Beginners-The-First-Code-Series-Book-1.docx
+++ b/docs/books/python-absolute-beginners/edition-01/Python-for-Absolute-Beginners-The-First-Code-Series-Book-1.docx
@@ -773,7 +773,7 @@
       </w:r>
     </w:p>
     <w:p>
-      <w:hyperlink w:history="1" r:id="rIdzjbqntbn9okentv2y_fyb">
+      <w:hyperlink w:history="1" r:id="rIdfp6lgg4ehm04o6bzlztux">
         <w:r>
           <w:rPr>
             <w:rStyle w:val="Hyperlink"/>
@@ -791,7 +791,7 @@
       </w:r>
     </w:p>
     <w:p>
-      <w:hyperlink w:history="1" r:id="rIdu7fpvrbnnkgnicjj6nf3d">
+      <w:hyperlink w:history="1" r:id="rIdykgwres3yki0uncclqrye">
         <w:r>
           <w:rPr>
             <w:rStyle w:val="Hyperlink"/>
@@ -3140,7 +3140,7 @@
       </w:r>
     </w:p>
     <w:p>
-      <w:hyperlink w:history="1" r:id="rId2kgoecb_rpfophdb72drr">
+      <w:hyperlink w:history="1" r:id="rIdf6bkrs0kmulehttam6cjv">
         <w:r>
           <w:rPr>
             <w:rStyle w:val="Hyperlink"/>
@@ -3158,7 +3158,7 @@
       </w:r>
     </w:p>
     <w:p>
-      <w:hyperlink w:history="1" r:id="rIdgswvstn1fqopcluo0fiht">
+      <w:hyperlink w:history="1" r:id="rIdnzahoaxamnxdkezp9tmyc">
         <w:r>
           <w:rPr>
             <w:rStyle w:val="Hyperlink"/>
@@ -7027,7 +7027,7 @@
       </w:r>
     </w:p>
     <w:p>
-      <w:hyperlink w:history="1" r:id="rIdeq1bqglqhs7vwasedkeeh">
+      <w:hyperlink w:history="1" r:id="rIdzlonkjrbpimuep9d3ontq">
         <w:r>
           <w:rPr>
             <w:rStyle w:val="Hyperlink"/>
@@ -7045,7 +7045,7 @@
       </w:r>
     </w:p>
     <w:p>
-      <w:hyperlink w:history="1" r:id="rIdrp2fj1muqraibtqxvt6mq">
+      <w:hyperlink w:history="1" r:id="rIduan0nlm5vruilxlqwuyxj">
         <w:r>
           <w:rPr>
             <w:rStyle w:val="Hyperlink"/>
@@ -7063,7 +7063,7 @@
       </w:r>
     </w:p>
     <w:p>
-      <w:hyperlink w:history="1" r:id="rIdrl177y-a9zxn7tdaornbb">
+      <w:hyperlink w:history="1" r:id="rIdkadqccs3hvkw5k848m8vw">
         <w:r>
           <w:rPr>
             <w:rStyle w:val="Hyperlink"/>
@@ -9117,7 +9117,7 @@
       </w:r>
     </w:p>
     <w:p>
-      <w:hyperlink w:history="1" r:id="rIdud0abpw0tefiavnjmabzw">
+      <w:hyperlink w:history="1" r:id="rIdxq94na6l0jqgelyngojsb">
         <w:r>
           <w:rPr>
             <w:rStyle w:val="Hyperlink"/>
@@ -9135,7 +9135,7 @@
       </w:r>
     </w:p>
     <w:p>
-      <w:hyperlink w:history="1" r:id="rIdfgx8fmvqsjbntsuzmyrmi">
+      <w:hyperlink w:history="1" r:id="rIdw1lcw3xbvfv0phhrpiqi2">
         <w:r>
           <w:rPr>
             <w:rStyle w:val="Hyperlink"/>
@@ -11888,7 +11888,7 @@
       </w:r>
     </w:p>
     <w:p>
-      <w:hyperlink w:history="1" r:id="rIdbpj3kd80naoormss1jfsb">
+      <w:hyperlink w:history="1" r:id="rIdlf-gleokj9vyduwryobp9">
         <w:r>
           <w:rPr>
             <w:rStyle w:val="Hyperlink"/>

</xml_diff>

<commit_message>
feat(ch01): integrate scenario image into briefing, build server step by step in code chunks, and render architectural anatomy diagram
Co-authored-by: arena-agent <297053741+arena-agent@users.noreply.github.com>
</commit_message>
<xml_diff>
--- a/docs/books/python-absolute-beginners/edition-01/Python-for-Absolute-Beginners-The-First-Code-Series-Book-1.docx
+++ b/docs/books/python-absolute-beginners/edition-01/Python-for-Absolute-Beginners-The-First-Code-Series-Book-1.docx
@@ -773,7 +773,7 @@
       </w:r>
     </w:p>
     <w:p>
-      <w:hyperlink w:history="1" r:id="rIdfp6lgg4ehm04o6bzlztux">
+      <w:hyperlink w:history="1" r:id="rIds14sfkdoxedrynohpjbrr">
         <w:r>
           <w:rPr>
             <w:rStyle w:val="Hyperlink"/>
@@ -791,7 +791,7 @@
       </w:r>
     </w:p>
     <w:p>
-      <w:hyperlink w:history="1" r:id="rIdykgwres3yki0uncclqrye">
+      <w:hyperlink w:history="1" r:id="rId1tmptvwsuv6h35abicm_y">
         <w:r>
           <w:rPr>
             <w:rStyle w:val="Hyperlink"/>
@@ -3140,7 +3140,7 @@
       </w:r>
     </w:p>
     <w:p>
-      <w:hyperlink w:history="1" r:id="rIdf6bkrs0kmulehttam6cjv">
+      <w:hyperlink w:history="1" r:id="rIdblrdgbuz5jbbkdsq662kh">
         <w:r>
           <w:rPr>
             <w:rStyle w:val="Hyperlink"/>
@@ -3158,7 +3158,7 @@
       </w:r>
     </w:p>
     <w:p>
-      <w:hyperlink w:history="1" r:id="rIdnzahoaxamnxdkezp9tmyc">
+      <w:hyperlink w:history="1" r:id="rIdye6spuaucf9fyfzjdpg1_">
         <w:r>
           <w:rPr>
             <w:rStyle w:val="Hyperlink"/>
@@ -7027,7 +7027,7 @@
       </w:r>
     </w:p>
     <w:p>
-      <w:hyperlink w:history="1" r:id="rIdzlonkjrbpimuep9d3ontq">
+      <w:hyperlink w:history="1" r:id="rId5n_q34lbx9cxjx165l5dh">
         <w:r>
           <w:rPr>
             <w:rStyle w:val="Hyperlink"/>
@@ -7045,7 +7045,7 @@
       </w:r>
     </w:p>
     <w:p>
-      <w:hyperlink w:history="1" r:id="rIduan0nlm5vruilxlqwuyxj">
+      <w:hyperlink w:history="1" r:id="rIdlyg7wvtaovmfvehesi0js">
         <w:r>
           <w:rPr>
             <w:rStyle w:val="Hyperlink"/>
@@ -7063,7 +7063,7 @@
       </w:r>
     </w:p>
     <w:p>
-      <w:hyperlink w:history="1" r:id="rIdkadqccs3hvkw5k848m8vw">
+      <w:hyperlink w:history="1" r:id="rId1ytkvfswtwziwga_etrcc">
         <w:r>
           <w:rPr>
             <w:rStyle w:val="Hyperlink"/>
@@ -9117,7 +9117,7 @@
       </w:r>
     </w:p>
     <w:p>
-      <w:hyperlink w:history="1" r:id="rIdxq94na6l0jqgelyngojsb">
+      <w:hyperlink w:history="1" r:id="rIdjlzsvu-xlhr36zqpjzptd">
         <w:r>
           <w:rPr>
             <w:rStyle w:val="Hyperlink"/>
@@ -9135,7 +9135,7 @@
       </w:r>
     </w:p>
     <w:p>
-      <w:hyperlink w:history="1" r:id="rIdw1lcw3xbvfv0phhrpiqi2">
+      <w:hyperlink w:history="1" r:id="rIdt9n4_fxmvrydupwvii_qr">
         <w:r>
           <w:rPr>
             <w:rStyle w:val="Hyperlink"/>
@@ -11888,7 +11888,7 @@
       </w:r>
     </w:p>
     <w:p>
-      <w:hyperlink w:history="1" r:id="rIdlf-gleokj9vyduwryobp9">
+      <w:hyperlink w:history="1" r:id="rIdvrw9eab5o-1zdmwd95hoq">
         <w:r>
           <w:rPr>
             <w:rStyle w:val="Hyperlink"/>

</xml_diff>

<commit_message>
feat(ch01): elevate real-world narrative, standalone mission briefing, and publication-grade diagram assets
Co-authored-by: arena-agent <297053741+arena-agent@users.noreply.github.com>
</commit_message>
<xml_diff>
--- a/docs/books/python-absolute-beginners/edition-01/Python-for-Absolute-Beginners-The-First-Code-Series-Book-1.docx
+++ b/docs/books/python-absolute-beginners/edition-01/Python-for-Absolute-Beginners-The-First-Code-Series-Book-1.docx
@@ -773,7 +773,7 @@
       </w:r>
     </w:p>
     <w:p>
-      <w:hyperlink w:history="1" r:id="rIds14sfkdoxedrynohpjbrr">
+      <w:hyperlink w:history="1" r:id="rIdhspzxcehpy6w5ous2cajh">
         <w:r>
           <w:rPr>
             <w:rStyle w:val="Hyperlink"/>
@@ -791,7 +791,7 @@
       </w:r>
     </w:p>
     <w:p>
-      <w:hyperlink w:history="1" r:id="rId1tmptvwsuv6h35abicm_y">
+      <w:hyperlink w:history="1" r:id="rIdnsjnnbmcmp_8ni0g7cfh4">
         <w:r>
           <w:rPr>
             <w:rStyle w:val="Hyperlink"/>
@@ -3140,7 +3140,7 @@
       </w:r>
     </w:p>
     <w:p>
-      <w:hyperlink w:history="1" r:id="rIdblrdgbuz5jbbkdsq662kh">
+      <w:hyperlink w:history="1" r:id="rIdgol4b7eayaxyghpcm3oaa">
         <w:r>
           <w:rPr>
             <w:rStyle w:val="Hyperlink"/>
@@ -3158,7 +3158,7 @@
       </w:r>
     </w:p>
     <w:p>
-      <w:hyperlink w:history="1" r:id="rIdye6spuaucf9fyfzjdpg1_">
+      <w:hyperlink w:history="1" r:id="rIdtwzmjg_cuhdzgez0ushs0">
         <w:r>
           <w:rPr>
             <w:rStyle w:val="Hyperlink"/>
@@ -7027,7 +7027,7 @@
       </w:r>
     </w:p>
     <w:p>
-      <w:hyperlink w:history="1" r:id="rId5n_q34lbx9cxjx165l5dh">
+      <w:hyperlink w:history="1" r:id="rId-_v3ahtsxguzcv26qcnmt">
         <w:r>
           <w:rPr>
             <w:rStyle w:val="Hyperlink"/>
@@ -7045,7 +7045,7 @@
       </w:r>
     </w:p>
     <w:p>
-      <w:hyperlink w:history="1" r:id="rIdlyg7wvtaovmfvehesi0js">
+      <w:hyperlink w:history="1" r:id="rIdyjcpmterrkw9jdlyxmgxn">
         <w:r>
           <w:rPr>
             <w:rStyle w:val="Hyperlink"/>
@@ -7063,7 +7063,7 @@
       </w:r>
     </w:p>
     <w:p>
-      <w:hyperlink w:history="1" r:id="rId1ytkvfswtwziwga_etrcc">
+      <w:hyperlink w:history="1" r:id="rIdjgqmko9qo6sybtihy3pux">
         <w:r>
           <w:rPr>
             <w:rStyle w:val="Hyperlink"/>
@@ -9117,7 +9117,7 @@
       </w:r>
     </w:p>
     <w:p>
-      <w:hyperlink w:history="1" r:id="rIdjlzsvu-xlhr36zqpjzptd">
+      <w:hyperlink w:history="1" r:id="rIdyd3to0kgja-_ctuqgk4ls">
         <w:r>
           <w:rPr>
             <w:rStyle w:val="Hyperlink"/>
@@ -9135,7 +9135,7 @@
       </w:r>
     </w:p>
     <w:p>
-      <w:hyperlink w:history="1" r:id="rIdt9n4_fxmvrydupwvii_qr">
+      <w:hyperlink w:history="1" r:id="rIdjw-7kzzfst9hnutcyygt5">
         <w:r>
           <w:rPr>
             <w:rStyle w:val="Hyperlink"/>
@@ -11888,7 +11888,7 @@
       </w:r>
     </w:p>
     <w:p>
-      <w:hyperlink w:history="1" r:id="rIdvrw9eab5o-1zdmwd95hoq">
+      <w:hyperlink w:history="1" r:id="rIdyswfk-giert0a3up7jfta">
         <w:r>
           <w:rPr>
             <w:rStyle w:val="Hyperlink"/>

</xml_diff>

<commit_message>
feat(ch01): add dedicated step-by-step visual diagrams for POST, GET, and PUT/PATCH/DELETE mutations
Co-authored-by: arena-agent <297053741+arena-agent@users.noreply.github.com>
</commit_message>
<xml_diff>
--- a/docs/books/python-absolute-beginners/edition-01/Python-for-Absolute-Beginners-The-First-Code-Series-Book-1.docx
+++ b/docs/books/python-absolute-beginners/edition-01/Python-for-Absolute-Beginners-The-First-Code-Series-Book-1.docx
@@ -773,7 +773,7 @@
       </w:r>
     </w:p>
     <w:p>
-      <w:hyperlink w:history="1" r:id="rIdhspzxcehpy6w5ous2cajh">
+      <w:hyperlink w:history="1" r:id="rId8h3aq4pxzva8c3tzci2zl">
         <w:r>
           <w:rPr>
             <w:rStyle w:val="Hyperlink"/>
@@ -791,7 +791,7 @@
       </w:r>
     </w:p>
     <w:p>
-      <w:hyperlink w:history="1" r:id="rIdnsjnnbmcmp_8ni0g7cfh4">
+      <w:hyperlink w:history="1" r:id="rIdvyi84ogqtcrmzo1pmqdzl">
         <w:r>
           <w:rPr>
             <w:rStyle w:val="Hyperlink"/>
@@ -3140,7 +3140,7 @@
       </w:r>
     </w:p>
     <w:p>
-      <w:hyperlink w:history="1" r:id="rIdgol4b7eayaxyghpcm3oaa">
+      <w:hyperlink w:history="1" r:id="rId5fzqiqr_oy0hsrnico6hb">
         <w:r>
           <w:rPr>
             <w:rStyle w:val="Hyperlink"/>
@@ -3158,7 +3158,7 @@
       </w:r>
     </w:p>
     <w:p>
-      <w:hyperlink w:history="1" r:id="rIdtwzmjg_cuhdzgez0ushs0">
+      <w:hyperlink w:history="1" r:id="rIduvux5ftnqqsjxclbkuham">
         <w:r>
           <w:rPr>
             <w:rStyle w:val="Hyperlink"/>
@@ -7027,7 +7027,7 @@
       </w:r>
     </w:p>
     <w:p>
-      <w:hyperlink w:history="1" r:id="rId-_v3ahtsxguzcv26qcnmt">
+      <w:hyperlink w:history="1" r:id="rIdsraghsx2xvqpcpe8kw_qf">
         <w:r>
           <w:rPr>
             <w:rStyle w:val="Hyperlink"/>
@@ -7045,7 +7045,7 @@
       </w:r>
     </w:p>
     <w:p>
-      <w:hyperlink w:history="1" r:id="rIdyjcpmterrkw9jdlyxmgxn">
+      <w:hyperlink w:history="1" r:id="rIdirehe9vtldhmw25ph5b-j">
         <w:r>
           <w:rPr>
             <w:rStyle w:val="Hyperlink"/>
@@ -7063,7 +7063,7 @@
       </w:r>
     </w:p>
     <w:p>
-      <w:hyperlink w:history="1" r:id="rIdjgqmko9qo6sybtihy3pux">
+      <w:hyperlink w:history="1" r:id="rIdnafs7zxq5omjaobebod3v">
         <w:r>
           <w:rPr>
             <w:rStyle w:val="Hyperlink"/>
@@ -9117,7 +9117,7 @@
       </w:r>
     </w:p>
     <w:p>
-      <w:hyperlink w:history="1" r:id="rIdyd3to0kgja-_ctuqgk4ls">
+      <w:hyperlink w:history="1" r:id="rIdybkr5ai7st_6lccew1pcf">
         <w:r>
           <w:rPr>
             <w:rStyle w:val="Hyperlink"/>
@@ -9135,7 +9135,7 @@
       </w:r>
     </w:p>
     <w:p>
-      <w:hyperlink w:history="1" r:id="rIdjw-7kzzfst9hnutcyygt5">
+      <w:hyperlink w:history="1" r:id="rIdrine7hs1fhxbtg3e8dzm2">
         <w:r>
           <w:rPr>
             <w:rStyle w:val="Hyperlink"/>
@@ -11888,7 +11888,7 @@
       </w:r>
     </w:p>
     <w:p>
-      <w:hyperlink w:history="1" r:id="rIdyswfk-giert0a3up7jfta">
+      <w:hyperlink w:history="1" r:id="rIdghojsrdpuyzshl8qpqpkj">
         <w:r>
           <w:rPr>
             <w:rStyle w:val="Hyperlink"/>

</xml_diff>

<commit_message>
feat(ch01): add high-end editorial photo of war room triage and first-principles engineer at 8:14 PM
Co-authored-by: arena-agent <297053741+arena-agent@users.noreply.github.com>
</commit_message>
<xml_diff>
--- a/docs/books/python-absolute-beginners/edition-01/Python-for-Absolute-Beginners-The-First-Code-Series-Book-1.docx
+++ b/docs/books/python-absolute-beginners/edition-01/Python-for-Absolute-Beginners-The-First-Code-Series-Book-1.docx
@@ -773,7 +773,7 @@
       </w:r>
     </w:p>
     <w:p>
-      <w:hyperlink w:history="1" r:id="rId8h3aq4pxzva8c3tzci2zl">
+      <w:hyperlink w:history="1" r:id="rIdol9fkh8iaxz81insspgsb">
         <w:r>
           <w:rPr>
             <w:rStyle w:val="Hyperlink"/>
@@ -791,7 +791,7 @@
       </w:r>
     </w:p>
     <w:p>
-      <w:hyperlink w:history="1" r:id="rIdvyi84ogqtcrmzo1pmqdzl">
+      <w:hyperlink w:history="1" r:id="rIdqsjxhcujjphiikdqwj2vg">
         <w:r>
           <w:rPr>
             <w:rStyle w:val="Hyperlink"/>
@@ -3140,7 +3140,7 @@
       </w:r>
     </w:p>
     <w:p>
-      <w:hyperlink w:history="1" r:id="rId5fzqiqr_oy0hsrnico6hb">
+      <w:hyperlink w:history="1" r:id="rId8ehu0zrn6pyktrast7wn6">
         <w:r>
           <w:rPr>
             <w:rStyle w:val="Hyperlink"/>
@@ -3158,7 +3158,7 @@
       </w:r>
     </w:p>
     <w:p>
-      <w:hyperlink w:history="1" r:id="rIduvux5ftnqqsjxclbkuham">
+      <w:hyperlink w:history="1" r:id="rIdkwhopqrruxkburpt1moay">
         <w:r>
           <w:rPr>
             <w:rStyle w:val="Hyperlink"/>
@@ -7027,7 +7027,7 @@
       </w:r>
     </w:p>
     <w:p>
-      <w:hyperlink w:history="1" r:id="rIdsraghsx2xvqpcpe8kw_qf">
+      <w:hyperlink w:history="1" r:id="rId4gmsxahiq1gwyikkokxnu">
         <w:r>
           <w:rPr>
             <w:rStyle w:val="Hyperlink"/>
@@ -7045,7 +7045,7 @@
       </w:r>
     </w:p>
     <w:p>
-      <w:hyperlink w:history="1" r:id="rIdirehe9vtldhmw25ph5b-j">
+      <w:hyperlink w:history="1" r:id="rIdhcz6h-chns0p-z_sriouc">
         <w:r>
           <w:rPr>
             <w:rStyle w:val="Hyperlink"/>
@@ -7063,7 +7063,7 @@
       </w:r>
     </w:p>
     <w:p>
-      <w:hyperlink w:history="1" r:id="rIdnafs7zxq5omjaobebod3v">
+      <w:hyperlink w:history="1" r:id="rIddwa3g-fatuwhz62mlnce6">
         <w:r>
           <w:rPr>
             <w:rStyle w:val="Hyperlink"/>
@@ -9117,7 +9117,7 @@
       </w:r>
     </w:p>
     <w:p>
-      <w:hyperlink w:history="1" r:id="rIdybkr5ai7st_6lccew1pcf">
+      <w:hyperlink w:history="1" r:id="rIdsnqt-d9u2sg38hf4arqmo">
         <w:r>
           <w:rPr>
             <w:rStyle w:val="Hyperlink"/>
@@ -9135,7 +9135,7 @@
       </w:r>
     </w:p>
     <w:p>
-      <w:hyperlink w:history="1" r:id="rIdrine7hs1fhxbtg3e8dzm2">
+      <w:hyperlink w:history="1" r:id="rIduxjdgbau9ia7bu1qm3-mo">
         <w:r>
           <w:rPr>
             <w:rStyle w:val="Hyperlink"/>
@@ -11888,7 +11888,7 @@
       </w:r>
     </w:p>
     <w:p>
-      <w:hyperlink w:history="1" r:id="rIdghojsrdpuyzshl8qpqpkj">
+      <w:hyperlink w:history="1" r:id="rIdtn4y9an0m01o-eqgmevps">
         <w:r>
           <w:rPr>
             <w:rStyle w:val="Hyperlink"/>

</xml_diff>

<commit_message>
feat(ch01): add Indian Madhubani heritage comic strip and 4-panel storyboard breakdown
Co-authored-by: arena-agent <297053741+arena-agent@users.noreply.github.com>
</commit_message>
<xml_diff>
--- a/docs/books/python-absolute-beginners/edition-01/Python-for-Absolute-Beginners-The-First-Code-Series-Book-1.docx
+++ b/docs/books/python-absolute-beginners/edition-01/Python-for-Absolute-Beginners-The-First-Code-Series-Book-1.docx
@@ -773,7 +773,7 @@
       </w:r>
     </w:p>
     <w:p>
-      <w:hyperlink w:history="1" r:id="rIdol9fkh8iaxz81insspgsb">
+      <w:hyperlink w:history="1" r:id="rId2gh_3mdg9j2exl3gwhw3n">
         <w:r>
           <w:rPr>
             <w:rStyle w:val="Hyperlink"/>
@@ -791,7 +791,7 @@
       </w:r>
     </w:p>
     <w:p>
-      <w:hyperlink w:history="1" r:id="rIdqsjxhcujjphiikdqwj2vg">
+      <w:hyperlink w:history="1" r:id="rIdofzywc4qjymcioiihoavw">
         <w:r>
           <w:rPr>
             <w:rStyle w:val="Hyperlink"/>
@@ -3140,7 +3140,7 @@
       </w:r>
     </w:p>
     <w:p>
-      <w:hyperlink w:history="1" r:id="rId8ehu0zrn6pyktrast7wn6">
+      <w:hyperlink w:history="1" r:id="rIdl8dpflhvfsxxtgpv2149q">
         <w:r>
           <w:rPr>
             <w:rStyle w:val="Hyperlink"/>
@@ -3158,7 +3158,7 @@
       </w:r>
     </w:p>
     <w:p>
-      <w:hyperlink w:history="1" r:id="rIdkwhopqrruxkburpt1moay">
+      <w:hyperlink w:history="1" r:id="rIdd6qpgg3qxw-bnpqn3y319">
         <w:r>
           <w:rPr>
             <w:rStyle w:val="Hyperlink"/>
@@ -7027,7 +7027,7 @@
       </w:r>
     </w:p>
     <w:p>
-      <w:hyperlink w:history="1" r:id="rId4gmsxahiq1gwyikkokxnu">
+      <w:hyperlink w:history="1" r:id="rIdzquz9s28ferp2lmez0xsq">
         <w:r>
           <w:rPr>
             <w:rStyle w:val="Hyperlink"/>
@@ -7045,7 +7045,7 @@
       </w:r>
     </w:p>
     <w:p>
-      <w:hyperlink w:history="1" r:id="rIdhcz6h-chns0p-z_sriouc">
+      <w:hyperlink w:history="1" r:id="rIduuzuiphygtun5h39ew8sa">
         <w:r>
           <w:rPr>
             <w:rStyle w:val="Hyperlink"/>
@@ -7063,7 +7063,7 @@
       </w:r>
     </w:p>
     <w:p>
-      <w:hyperlink w:history="1" r:id="rIddwa3g-fatuwhz62mlnce6">
+      <w:hyperlink w:history="1" r:id="rIdf-u67z8qywzokdbuq2usx">
         <w:r>
           <w:rPr>
             <w:rStyle w:val="Hyperlink"/>
@@ -9117,7 +9117,7 @@
       </w:r>
     </w:p>
     <w:p>
-      <w:hyperlink w:history="1" r:id="rIdsnqt-d9u2sg38hf4arqmo">
+      <w:hyperlink w:history="1" r:id="rIdocfitlbxipijnqrwgeund">
         <w:r>
           <w:rPr>
             <w:rStyle w:val="Hyperlink"/>
@@ -9135,7 +9135,7 @@
       </w:r>
     </w:p>
     <w:p>
-      <w:hyperlink w:history="1" r:id="rIduxjdgbau9ia7bu1qm3-mo">
+      <w:hyperlink w:history="1" r:id="rIdlficg40szwmbahrx_zspe">
         <w:r>
           <w:rPr>
             <w:rStyle w:val="Hyperlink"/>
@@ -11888,7 +11888,7 @@
       </w:r>
     </w:p>
     <w:p>
-      <w:hyperlink w:history="1" r:id="rIdtn4y9an0m01o-eqgmevps">
+      <w:hyperlink w:history="1" r:id="rIdshu-elxrpqoh-g65hyzdp">
         <w:r>
           <w:rPr>
             <w:rStyle w:val="Hyperlink"/>

</xml_diff>

<commit_message>
feat(ch01): sequence war room narrative into 4 proper story beats with respective cropped panel images
Co-authored-by: arena-agent <297053741+arena-agent@users.noreply.github.com>
</commit_message>
<xml_diff>
--- a/docs/books/python-absolute-beginners/edition-01/Python-for-Absolute-Beginners-The-First-Code-Series-Book-1.docx
+++ b/docs/books/python-absolute-beginners/edition-01/Python-for-Absolute-Beginners-The-First-Code-Series-Book-1.docx
@@ -773,7 +773,7 @@
       </w:r>
     </w:p>
     <w:p>
-      <w:hyperlink w:history="1" r:id="rId2gh_3mdg9j2exl3gwhw3n">
+      <w:hyperlink w:history="1" r:id="rIdu5i5jemn-wkmcwaga6iqf">
         <w:r>
           <w:rPr>
             <w:rStyle w:val="Hyperlink"/>
@@ -791,7 +791,7 @@
       </w:r>
     </w:p>
     <w:p>
-      <w:hyperlink w:history="1" r:id="rIdofzywc4qjymcioiihoavw">
+      <w:hyperlink w:history="1" r:id="rIdvs15k5dd1u22ogdcuvhuw">
         <w:r>
           <w:rPr>
             <w:rStyle w:val="Hyperlink"/>
@@ -3140,7 +3140,7 @@
       </w:r>
     </w:p>
     <w:p>
-      <w:hyperlink w:history="1" r:id="rIdl8dpflhvfsxxtgpv2149q">
+      <w:hyperlink w:history="1" r:id="rIdxlm0tbcuzgkr8zgruhhtl">
         <w:r>
           <w:rPr>
             <w:rStyle w:val="Hyperlink"/>
@@ -3158,7 +3158,7 @@
       </w:r>
     </w:p>
     <w:p>
-      <w:hyperlink w:history="1" r:id="rIdd6qpgg3qxw-bnpqn3y319">
+      <w:hyperlink w:history="1" r:id="rIdms4x-sbj4mcateu5dlg7n">
         <w:r>
           <w:rPr>
             <w:rStyle w:val="Hyperlink"/>
@@ -7027,7 +7027,7 @@
       </w:r>
     </w:p>
     <w:p>
-      <w:hyperlink w:history="1" r:id="rIdzquz9s28ferp2lmez0xsq">
+      <w:hyperlink w:history="1" r:id="rIdoeyd8d38obr7b3p_yxaiq">
         <w:r>
           <w:rPr>
             <w:rStyle w:val="Hyperlink"/>
@@ -7045,7 +7045,7 @@
       </w:r>
     </w:p>
     <w:p>
-      <w:hyperlink w:history="1" r:id="rIduuzuiphygtun5h39ew8sa">
+      <w:hyperlink w:history="1" r:id="rId3xqzlynhd_niaijxcuyln">
         <w:r>
           <w:rPr>
             <w:rStyle w:val="Hyperlink"/>
@@ -7063,7 +7063,7 @@
       </w:r>
     </w:p>
     <w:p>
-      <w:hyperlink w:history="1" r:id="rIdf-u67z8qywzokdbuq2usx">
+      <w:hyperlink w:history="1" r:id="rId8cjepszidml49okbzxc9o">
         <w:r>
           <w:rPr>
             <w:rStyle w:val="Hyperlink"/>
@@ -9117,7 +9117,7 @@
       </w:r>
     </w:p>
     <w:p>
-      <w:hyperlink w:history="1" r:id="rIdocfitlbxipijnqrwgeund">
+      <w:hyperlink w:history="1" r:id="rIdb15lsg8iuzvybqtdvipsi">
         <w:r>
           <w:rPr>
             <w:rStyle w:val="Hyperlink"/>
@@ -9135,7 +9135,7 @@
       </w:r>
     </w:p>
     <w:p>
-      <w:hyperlink w:history="1" r:id="rIdlficg40szwmbahrx_zspe">
+      <w:hyperlink w:history="1" r:id="rIdadrp1kgtufmlcpxvz5fq2">
         <w:r>
           <w:rPr>
             <w:rStyle w:val="Hyperlink"/>
@@ -11888,7 +11888,7 @@
       </w:r>
     </w:p>
     <w:p>
-      <w:hyperlink w:history="1" r:id="rIdshu-elxrpqoh-g65hyzdp">
+      <w:hyperlink w:history="1" r:id="rIdo9yftwf_paecr5lvobpdi">
         <w:r>
           <w:rPr>
             <w:rStyle w:val="Hyperlink"/>

</xml_diff>

<commit_message>
feat(mission1): integrate hybrid split-panel scene visuals, English-only artwork, and dramatic character arcs across Ch 1-3
Co-authored-by: arena-agent <297053741+arena-agent@users.noreply.github.com>
</commit_message>
<xml_diff>
--- a/docs/books/python-absolute-beginners/edition-01/Python-for-Absolute-Beginners-The-First-Code-Series-Book-1.docx
+++ b/docs/books/python-absolute-beginners/edition-01/Python-for-Absolute-Beginners-The-First-Code-Series-Book-1.docx
@@ -773,7 +773,7 @@
       </w:r>
     </w:p>
     <w:p>
-      <w:hyperlink w:history="1" r:id="rIdu5i5jemn-wkmcwaga6iqf">
+      <w:hyperlink w:history="1" r:id="rIdny-i06mmvesu_ha5tjrfg">
         <w:r>
           <w:rPr>
             <w:rStyle w:val="Hyperlink"/>
@@ -791,7 +791,7 @@
       </w:r>
     </w:p>
     <w:p>
-      <w:hyperlink w:history="1" r:id="rIdvs15k5dd1u22ogdcuvhuw">
+      <w:hyperlink w:history="1" r:id="rIdcucdfia1fmwc-jxl49xwd">
         <w:r>
           <w:rPr>
             <w:rStyle w:val="Hyperlink"/>
@@ -3140,7 +3140,7 @@
       </w:r>
     </w:p>
     <w:p>
-      <w:hyperlink w:history="1" r:id="rIdxlm0tbcuzgkr8zgruhhtl">
+      <w:hyperlink w:history="1" r:id="rIdnhjiolo6gkfvxrqmmewcd">
         <w:r>
           <w:rPr>
             <w:rStyle w:val="Hyperlink"/>
@@ -3158,7 +3158,7 @@
       </w:r>
     </w:p>
     <w:p>
-      <w:hyperlink w:history="1" r:id="rIdms4x-sbj4mcateu5dlg7n">
+      <w:hyperlink w:history="1" r:id="rId8wxjplj6pc1a_eogqu7ef">
         <w:r>
           <w:rPr>
             <w:rStyle w:val="Hyperlink"/>
@@ -7027,7 +7027,7 @@
       </w:r>
     </w:p>
     <w:p>
-      <w:hyperlink w:history="1" r:id="rIdoeyd8d38obr7b3p_yxaiq">
+      <w:hyperlink w:history="1" r:id="rIderfho3-xoce-5pzgw-mmr">
         <w:r>
           <w:rPr>
             <w:rStyle w:val="Hyperlink"/>
@@ -7045,7 +7045,7 @@
       </w:r>
     </w:p>
     <w:p>
-      <w:hyperlink w:history="1" r:id="rId3xqzlynhd_niaijxcuyln">
+      <w:hyperlink w:history="1" r:id="rIdymhwpxhwvpqbq74myah0p">
         <w:r>
           <w:rPr>
             <w:rStyle w:val="Hyperlink"/>
@@ -7063,7 +7063,7 @@
       </w:r>
     </w:p>
     <w:p>
-      <w:hyperlink w:history="1" r:id="rId8cjepszidml49okbzxc9o">
+      <w:hyperlink w:history="1" r:id="rIdae9pcwu0kpdjl-df7msk7">
         <w:r>
           <w:rPr>
             <w:rStyle w:val="Hyperlink"/>
@@ -9117,7 +9117,7 @@
       </w:r>
     </w:p>
     <w:p>
-      <w:hyperlink w:history="1" r:id="rIdb15lsg8iuzvybqtdvipsi">
+      <w:hyperlink w:history="1" r:id="rIdd44qupcgrf65pgahralf2">
         <w:r>
           <w:rPr>
             <w:rStyle w:val="Hyperlink"/>
@@ -9135,7 +9135,7 @@
       </w:r>
     </w:p>
     <w:p>
-      <w:hyperlink w:history="1" r:id="rIdadrp1kgtufmlcpxvz5fq2">
+      <w:hyperlink w:history="1" r:id="rId-a6hyzzh4jhvhlvrklre-">
         <w:r>
           <w:rPr>
             <w:rStyle w:val="Hyperlink"/>
@@ -11888,7 +11888,7 @@
       </w:r>
     </w:p>
     <w:p>
-      <w:hyperlink w:history="1" r:id="rIdo9yftwf_paecr5lvobpdi">
+      <w:hyperlink w:history="1" r:id="rId_bb4irvo2jkjdokf2s2lo">
         <w:r>
           <w:rPr>
             <w:rStyle w:val="Hyperlink"/>

</xml_diff>

<commit_message>
feat(mission1): replace Devanagari with English-only text in hybrid scenes and illustrate Postman UI layout
Co-authored-by: arena-agent <297053741+arena-agent@users.noreply.github.com>
</commit_message>
<xml_diff>
--- a/docs/books/python-absolute-beginners/edition-01/Python-for-Absolute-Beginners-The-First-Code-Series-Book-1.docx
+++ b/docs/books/python-absolute-beginners/edition-01/Python-for-Absolute-Beginners-The-First-Code-Series-Book-1.docx
@@ -773,7 +773,7 @@
       </w:r>
     </w:p>
     <w:p>
-      <w:hyperlink w:history="1" r:id="rIdny-i06mmvesu_ha5tjrfg">
+      <w:hyperlink w:history="1" r:id="rIdpu4e8vis7cbixms6wotmg">
         <w:r>
           <w:rPr>
             <w:rStyle w:val="Hyperlink"/>
@@ -791,7 +791,7 @@
       </w:r>
     </w:p>
     <w:p>
-      <w:hyperlink w:history="1" r:id="rIdcucdfia1fmwc-jxl49xwd">
+      <w:hyperlink w:history="1" r:id="rIdu-it80bq1lfoaufgushis">
         <w:r>
           <w:rPr>
             <w:rStyle w:val="Hyperlink"/>
@@ -3140,7 +3140,7 @@
       </w:r>
     </w:p>
     <w:p>
-      <w:hyperlink w:history="1" r:id="rIdnhjiolo6gkfvxrqmmewcd">
+      <w:hyperlink w:history="1" r:id="rIdpmm1_ycyj7jom1nu5dxvl">
         <w:r>
           <w:rPr>
             <w:rStyle w:val="Hyperlink"/>
@@ -3158,7 +3158,7 @@
       </w:r>
     </w:p>
     <w:p>
-      <w:hyperlink w:history="1" r:id="rId8wxjplj6pc1a_eogqu7ef">
+      <w:hyperlink w:history="1" r:id="rId7aa46rkhrpg4fjzgmv339">
         <w:r>
           <w:rPr>
             <w:rStyle w:val="Hyperlink"/>
@@ -7027,7 +7027,7 @@
       </w:r>
     </w:p>
     <w:p>
-      <w:hyperlink w:history="1" r:id="rIderfho3-xoce-5pzgw-mmr">
+      <w:hyperlink w:history="1" r:id="rIdlwjd3t2x88ymh7ua4ndfg">
         <w:r>
           <w:rPr>
             <w:rStyle w:val="Hyperlink"/>
@@ -7045,7 +7045,7 @@
       </w:r>
     </w:p>
     <w:p>
-      <w:hyperlink w:history="1" r:id="rIdymhwpxhwvpqbq74myah0p">
+      <w:hyperlink w:history="1" r:id="rIdbpoqai2tjbzguj1hmu68f">
         <w:r>
           <w:rPr>
             <w:rStyle w:val="Hyperlink"/>
@@ -7063,7 +7063,7 @@
       </w:r>
     </w:p>
     <w:p>
-      <w:hyperlink w:history="1" r:id="rIdae9pcwu0kpdjl-df7msk7">
+      <w:hyperlink w:history="1" r:id="rIdyb-jgt_gqcunkwy5rzfil">
         <w:r>
           <w:rPr>
             <w:rStyle w:val="Hyperlink"/>
@@ -9117,7 +9117,7 @@
       </w:r>
     </w:p>
     <w:p>
-      <w:hyperlink w:history="1" r:id="rIdd44qupcgrf65pgahralf2">
+      <w:hyperlink w:history="1" r:id="rIdrx-vx4s29phc-eq7t8_gh">
         <w:r>
           <w:rPr>
             <w:rStyle w:val="Hyperlink"/>
@@ -9135,7 +9135,7 @@
       </w:r>
     </w:p>
     <w:p>
-      <w:hyperlink w:history="1" r:id="rId-a6hyzzh4jhvhlvrklre-">
+      <w:hyperlink w:history="1" r:id="rIde_7dcdnsnt1wsdqivbvfu">
         <w:r>
           <w:rPr>
             <w:rStyle w:val="Hyperlink"/>
@@ -11888,7 +11888,7 @@
       </w:r>
     </w:p>
     <w:p>
-      <w:hyperlink w:history="1" r:id="rId_bb4irvo2jkjdokf2s2lo">
+      <w:hyperlink w:history="1" r:id="rIdnhry8cgswpupeyyoolpxy">
         <w:r>
           <w:rPr>
             <w:rStyle w:val="Hyperlink"/>

</xml_diff>

<commit_message>
feat(mission1): add character comic speech clouds explaining code and authentic software UI panes across all Mission 1 scenes
Co-authored-by: arena-agent <297053741+arena-agent@users.noreply.github.com>
</commit_message>
<xml_diff>
--- a/docs/books/python-absolute-beginners/edition-01/Python-for-Absolute-Beginners-The-First-Code-Series-Book-1.docx
+++ b/docs/books/python-absolute-beginners/edition-01/Python-for-Absolute-Beginners-The-First-Code-Series-Book-1.docx
@@ -773,7 +773,7 @@
       </w:r>
     </w:p>
     <w:p>
-      <w:hyperlink w:history="1" r:id="rIdpu4e8vis7cbixms6wotmg">
+      <w:hyperlink w:history="1" r:id="rIdncj1mh-wloenlrmcjvmsb">
         <w:r>
           <w:rPr>
             <w:rStyle w:val="Hyperlink"/>
@@ -791,7 +791,7 @@
       </w:r>
     </w:p>
     <w:p>
-      <w:hyperlink w:history="1" r:id="rIdu-it80bq1lfoaufgushis">
+      <w:hyperlink w:history="1" r:id="rIdqobh5eq1falrmkwbbm7bw">
         <w:r>
           <w:rPr>
             <w:rStyle w:val="Hyperlink"/>
@@ -3140,7 +3140,7 @@
       </w:r>
     </w:p>
     <w:p>
-      <w:hyperlink w:history="1" r:id="rIdpmm1_ycyj7jom1nu5dxvl">
+      <w:hyperlink w:history="1" r:id="rId5bqmng_2kgn0c54tic8a3">
         <w:r>
           <w:rPr>
             <w:rStyle w:val="Hyperlink"/>
@@ -3158,7 +3158,7 @@
       </w:r>
     </w:p>
     <w:p>
-      <w:hyperlink w:history="1" r:id="rId7aa46rkhrpg4fjzgmv339">
+      <w:hyperlink w:history="1" r:id="rIdpddhcjdkjiac1zrccjnv5">
         <w:r>
           <w:rPr>
             <w:rStyle w:val="Hyperlink"/>
@@ -7027,7 +7027,7 @@
       </w:r>
     </w:p>
     <w:p>
-      <w:hyperlink w:history="1" r:id="rIdlwjd3t2x88ymh7ua4ndfg">
+      <w:hyperlink w:history="1" r:id="rIddsrymale42y7fhjmudsua">
         <w:r>
           <w:rPr>
             <w:rStyle w:val="Hyperlink"/>
@@ -7045,7 +7045,7 @@
       </w:r>
     </w:p>
     <w:p>
-      <w:hyperlink w:history="1" r:id="rIdbpoqai2tjbzguj1hmu68f">
+      <w:hyperlink w:history="1" r:id="rIdg0_hlfjrpso6t78wj0y0j">
         <w:r>
           <w:rPr>
             <w:rStyle w:val="Hyperlink"/>
@@ -7063,7 +7063,7 @@
       </w:r>
     </w:p>
     <w:p>
-      <w:hyperlink w:history="1" r:id="rIdyb-jgt_gqcunkwy5rzfil">
+      <w:hyperlink w:history="1" r:id="rIdlzrncg7kpzknlhiote4w3">
         <w:r>
           <w:rPr>
             <w:rStyle w:val="Hyperlink"/>
@@ -9117,7 +9117,7 @@
       </w:r>
     </w:p>
     <w:p>
-      <w:hyperlink w:history="1" r:id="rIdrx-vx4s29phc-eq7t8_gh">
+      <w:hyperlink w:history="1" r:id="rIdjf66ftilqh5j-gqy2aogp">
         <w:r>
           <w:rPr>
             <w:rStyle w:val="Hyperlink"/>
@@ -9135,7 +9135,7 @@
       </w:r>
     </w:p>
     <w:p>
-      <w:hyperlink w:history="1" r:id="rIde_7dcdnsnt1wsdqivbvfu">
+      <w:hyperlink w:history="1" r:id="rId4yndylcsvqqdzjou05cn3">
         <w:r>
           <w:rPr>
             <w:rStyle w:val="Hyperlink"/>
@@ -11888,7 +11888,7 @@
       </w:r>
     </w:p>
     <w:p>
-      <w:hyperlink w:history="1" r:id="rIdnhry8cgswpupeyyoolpxy">
+      <w:hyperlink w:history="1" r:id="rIdcomc_xvjz3tnlkim-2tbg">
         <w:r>
           <w:rPr>
             <w:rStyle w:val="Hyperlink"/>

</xml_diff>

<commit_message>
feat(mission-2): add comic-cloud visual storytelling and authentic UI panels for chapters 4-7
Co-authored-by: arena-agent <297053741+arena-agent@users.noreply.github.com>
</commit_message>
<xml_diff>
--- a/docs/books/python-absolute-beginners/edition-01/Python-for-Absolute-Beginners-The-First-Code-Series-Book-1.docx
+++ b/docs/books/python-absolute-beginners/edition-01/Python-for-Absolute-Beginners-The-First-Code-Series-Book-1.docx
@@ -773,7 +773,7 @@
       </w:r>
     </w:p>
     <w:p>
-      <w:hyperlink w:history="1" r:id="rIdncj1mh-wloenlrmcjvmsb">
+      <w:hyperlink w:history="1" r:id="rIdjzmu7xahioukcc5w8yp0b">
         <w:r>
           <w:rPr>
             <w:rStyle w:val="Hyperlink"/>
@@ -791,7 +791,7 @@
       </w:r>
     </w:p>
     <w:p>
-      <w:hyperlink w:history="1" r:id="rIdqobh5eq1falrmkwbbm7bw">
+      <w:hyperlink w:history="1" r:id="rIdbpvvh3lqerhilpnk6fmes">
         <w:r>
           <w:rPr>
             <w:rStyle w:val="Hyperlink"/>
@@ -3140,7 +3140,7 @@
       </w:r>
     </w:p>
     <w:p>
-      <w:hyperlink w:history="1" r:id="rId5bqmng_2kgn0c54tic8a3">
+      <w:hyperlink w:history="1" r:id="rId0fxoeta4znxzxeuykvi0h">
         <w:r>
           <w:rPr>
             <w:rStyle w:val="Hyperlink"/>
@@ -3158,7 +3158,7 @@
       </w:r>
     </w:p>
     <w:p>
-      <w:hyperlink w:history="1" r:id="rIdpddhcjdkjiac1zrccjnv5">
+      <w:hyperlink w:history="1" r:id="rIdducslw-xmnos1gc9ryfkc">
         <w:r>
           <w:rPr>
             <w:rStyle w:val="Hyperlink"/>
@@ -7027,7 +7027,7 @@
       </w:r>
     </w:p>
     <w:p>
-      <w:hyperlink w:history="1" r:id="rIddsrymale42y7fhjmudsua">
+      <w:hyperlink w:history="1" r:id="rIdzm44-sdm_8uqtcn_frmg4">
         <w:r>
           <w:rPr>
             <w:rStyle w:val="Hyperlink"/>
@@ -7045,7 +7045,7 @@
       </w:r>
     </w:p>
     <w:p>
-      <w:hyperlink w:history="1" r:id="rIdg0_hlfjrpso6t78wj0y0j">
+      <w:hyperlink w:history="1" r:id="rId0czqhq5c1fk5smqtj9e5f">
         <w:r>
           <w:rPr>
             <w:rStyle w:val="Hyperlink"/>
@@ -7063,7 +7063,7 @@
       </w:r>
     </w:p>
     <w:p>
-      <w:hyperlink w:history="1" r:id="rIdlzrncg7kpzknlhiote4w3">
+      <w:hyperlink w:history="1" r:id="rIdfxmghbwp13m4dojlieqpj">
         <w:r>
           <w:rPr>
             <w:rStyle w:val="Hyperlink"/>
@@ -9117,7 +9117,7 @@
       </w:r>
     </w:p>
     <w:p>
-      <w:hyperlink w:history="1" r:id="rIdjf66ftilqh5j-gqy2aogp">
+      <w:hyperlink w:history="1" r:id="rIdzxaqu305rivtrfzxl_iel">
         <w:r>
           <w:rPr>
             <w:rStyle w:val="Hyperlink"/>
@@ -9135,7 +9135,7 @@
       </w:r>
     </w:p>
     <w:p>
-      <w:hyperlink w:history="1" r:id="rId4yndylcsvqqdzjou05cn3">
+      <w:hyperlink w:history="1" r:id="rIdw1emt0wfpq2yu6ax9dj0i">
         <w:r>
           <w:rPr>
             <w:rStyle w:val="Hyperlink"/>
@@ -11888,7 +11888,7 @@
       </w:r>
     </w:p>
     <w:p>
-      <w:hyperlink w:history="1" r:id="rIdcomc_xvjz3tnlkim-2tbg">
+      <w:hyperlink w:history="1" r:id="rIdvl2de6reiiokqeii3znnd">
         <w:r>
           <w:rPr>
             <w:rStyle w:val="Hyperlink"/>

</xml_diff>

<commit_message>
chore: sync generated docx files
Co-authored-by: arena-agent <297053741+arena-agent@users.noreply.github.com>
</commit_message>
<xml_diff>
--- a/docs/books/python-absolute-beginners/edition-01/Python-for-Absolute-Beginners-The-First-Code-Series-Book-1.docx
+++ b/docs/books/python-absolute-beginners/edition-01/Python-for-Absolute-Beginners-The-First-Code-Series-Book-1.docx
@@ -773,7 +773,7 @@
       </w:r>
     </w:p>
     <w:p>
-      <w:hyperlink w:history="1" r:id="rIdjzmu7xahioukcc5w8yp0b">
+      <w:hyperlink w:history="1" r:id="rIda9izhk_oteskylabdq52q">
         <w:r>
           <w:rPr>
             <w:rStyle w:val="Hyperlink"/>
@@ -791,7 +791,7 @@
       </w:r>
     </w:p>
     <w:p>
-      <w:hyperlink w:history="1" r:id="rIdbpvvh3lqerhilpnk6fmes">
+      <w:hyperlink w:history="1" r:id="rIdxsi0qovwoesonukawhagx">
         <w:r>
           <w:rPr>
             <w:rStyle w:val="Hyperlink"/>
@@ -3140,7 +3140,7 @@
       </w:r>
     </w:p>
     <w:p>
-      <w:hyperlink w:history="1" r:id="rId0fxoeta4znxzxeuykvi0h">
+      <w:hyperlink w:history="1" r:id="rIdpo4bcsrknkb8qje9u5c7n">
         <w:r>
           <w:rPr>
             <w:rStyle w:val="Hyperlink"/>
@@ -3158,7 +3158,7 @@
       </w:r>
     </w:p>
     <w:p>
-      <w:hyperlink w:history="1" r:id="rIdducslw-xmnos1gc9ryfkc">
+      <w:hyperlink w:history="1" r:id="rIdccpzrtmr7gj_38j7byztd">
         <w:r>
           <w:rPr>
             <w:rStyle w:val="Hyperlink"/>
@@ -7027,7 +7027,7 @@
       </w:r>
     </w:p>
     <w:p>
-      <w:hyperlink w:history="1" r:id="rIdzm44-sdm_8uqtcn_frmg4">
+      <w:hyperlink w:history="1" r:id="rIdlbfem-gzmxynqf4ipdquo">
         <w:r>
           <w:rPr>
             <w:rStyle w:val="Hyperlink"/>
@@ -7045,7 +7045,7 @@
       </w:r>
     </w:p>
     <w:p>
-      <w:hyperlink w:history="1" r:id="rId0czqhq5c1fk5smqtj9e5f">
+      <w:hyperlink w:history="1" r:id="rIdahu0txo7ntenx4jenvijd">
         <w:r>
           <w:rPr>
             <w:rStyle w:val="Hyperlink"/>
@@ -7063,7 +7063,7 @@
       </w:r>
     </w:p>
     <w:p>
-      <w:hyperlink w:history="1" r:id="rIdfxmghbwp13m4dojlieqpj">
+      <w:hyperlink w:history="1" r:id="rIddilivc6g8zsj6bnw4ckxh">
         <w:r>
           <w:rPr>
             <w:rStyle w:val="Hyperlink"/>
@@ -9117,7 +9117,7 @@
       </w:r>
     </w:p>
     <w:p>
-      <w:hyperlink w:history="1" r:id="rIdzxaqu305rivtrfzxl_iel">
+      <w:hyperlink w:history="1" r:id="rId223drkpxaxcziwchlf0tt">
         <w:r>
           <w:rPr>
             <w:rStyle w:val="Hyperlink"/>
@@ -9135,7 +9135,7 @@
       </w:r>
     </w:p>
     <w:p>
-      <w:hyperlink w:history="1" r:id="rIdw1emt0wfpq2yu6ax9dj0i">
+      <w:hyperlink w:history="1" r:id="rIdrxwzfaiixkskthcce2iro">
         <w:r>
           <w:rPr>
             <w:rStyle w:val="Hyperlink"/>
@@ -11888,7 +11888,7 @@
       </w:r>
     </w:p>
     <w:p>
-      <w:hyperlink w:history="1" r:id="rIdvl2de6reiiokqeii3znnd">
+      <w:hyperlink w:history="1" r:id="rId3byduqcdg8jvmi8wn--tt">
         <w:r>
           <w:rPr>
             <w:rStyle w:val="Hyperlink"/>

</xml_diff>

<commit_message>
feat(workbench): add ComicWorkbench component and integrate Akshay & Sameer in IDE and API Testing app in Ch 1
Co-authored-by: arena-agent <297053741+arena-agent@users.noreply.github.com>
</commit_message>
<xml_diff>
--- a/docs/books/python-absolute-beginners/edition-01/Python-for-Absolute-Beginners-The-First-Code-Series-Book-1.docx
+++ b/docs/books/python-absolute-beginners/edition-01/Python-for-Absolute-Beginners-The-First-Code-Series-Book-1.docx
@@ -773,7 +773,7 @@
       </w:r>
     </w:p>
     <w:p>
-      <w:hyperlink w:history="1" r:id="rIda9izhk_oteskylabdq52q">
+      <w:hyperlink w:history="1" r:id="rId85kcjmqkk7ytzdvgxv8mb">
         <w:r>
           <w:rPr>
             <w:rStyle w:val="Hyperlink"/>
@@ -791,7 +791,7 @@
       </w:r>
     </w:p>
     <w:p>
-      <w:hyperlink w:history="1" r:id="rIdxsi0qovwoesonukawhagx">
+      <w:hyperlink w:history="1" r:id="rIduzz5az909etdkbws7e38z">
         <w:r>
           <w:rPr>
             <w:rStyle w:val="Hyperlink"/>
@@ -3140,7 +3140,7 @@
       </w:r>
     </w:p>
     <w:p>
-      <w:hyperlink w:history="1" r:id="rIdpo4bcsrknkb8qje9u5c7n">
+      <w:hyperlink w:history="1" r:id="rIdqcyiluqkjpui51b3qrku4">
         <w:r>
           <w:rPr>
             <w:rStyle w:val="Hyperlink"/>
@@ -3158,7 +3158,7 @@
       </w:r>
     </w:p>
     <w:p>
-      <w:hyperlink w:history="1" r:id="rIdccpzrtmr7gj_38j7byztd">
+      <w:hyperlink w:history="1" r:id="rIdrfu5omxrzmccd_sis7hyj">
         <w:r>
           <w:rPr>
             <w:rStyle w:val="Hyperlink"/>
@@ -7027,7 +7027,7 @@
       </w:r>
     </w:p>
     <w:p>
-      <w:hyperlink w:history="1" r:id="rIdlbfem-gzmxynqf4ipdquo">
+      <w:hyperlink w:history="1" r:id="rIdvtlfbnqx8l5k_nkpru6g9">
         <w:r>
           <w:rPr>
             <w:rStyle w:val="Hyperlink"/>
@@ -7045,7 +7045,7 @@
       </w:r>
     </w:p>
     <w:p>
-      <w:hyperlink w:history="1" r:id="rIdahu0txo7ntenx4jenvijd">
+      <w:hyperlink w:history="1" r:id="rId30stmoaxbxryghknewfzs">
         <w:r>
           <w:rPr>
             <w:rStyle w:val="Hyperlink"/>
@@ -7063,7 +7063,7 @@
       </w:r>
     </w:p>
     <w:p>
-      <w:hyperlink w:history="1" r:id="rIddilivc6g8zsj6bnw4ckxh">
+      <w:hyperlink w:history="1" r:id="rIdefz7oshnx7rymzyazdcsb">
         <w:r>
           <w:rPr>
             <w:rStyle w:val="Hyperlink"/>
@@ -9117,7 +9117,7 @@
       </w:r>
     </w:p>
     <w:p>
-      <w:hyperlink w:history="1" r:id="rId223drkpxaxcziwchlf0tt">
+      <w:hyperlink w:history="1" r:id="rIdmdm4kixravm0wx3i5zdnr">
         <w:r>
           <w:rPr>
             <w:rStyle w:val="Hyperlink"/>
@@ -9135,7 +9135,7 @@
       </w:r>
     </w:p>
     <w:p>
-      <w:hyperlink w:history="1" r:id="rIdrxwzfaiixkskthcce2iro">
+      <w:hyperlink w:history="1" r:id="rIdszdovhkdvvlmwkd6wible">
         <w:r>
           <w:rPr>
             <w:rStyle w:val="Hyperlink"/>
@@ -11888,7 +11888,7 @@
       </w:r>
     </w:p>
     <w:p>
-      <w:hyperlink w:history="1" r:id="rId3byduqcdg8jvmi8wn--tt">
+      <w:hyperlink w:history="1" r:id="rIdj-vrjiuu4dv6axnuetf7w">
         <w:r>
           <w:rPr>
             <w:rStyle w:val="Hyperlink"/>

</xml_diff>

<commit_message>
feat: complete Mission 1 comic workbenches and narrative continuity across chapters 1-3
Co-authored-by: arena-agent <297053741+arena-agent@users.noreply.github.com>
</commit_message>
<xml_diff>
--- a/docs/books/python-absolute-beginners/edition-01/Python-for-Absolute-Beginners-The-First-Code-Series-Book-1.docx
+++ b/docs/books/python-absolute-beginners/edition-01/Python-for-Absolute-Beginners-The-First-Code-Series-Book-1.docx
@@ -773,7 +773,7 @@
       </w:r>
     </w:p>
     <w:p>
-      <w:hyperlink w:history="1" r:id="rId85kcjmqkk7ytzdvgxv8mb">
+      <w:hyperlink w:history="1" r:id="rIdwxenrcizrv0jz0veuxg4v">
         <w:r>
           <w:rPr>
             <w:rStyle w:val="Hyperlink"/>
@@ -791,7 +791,7 @@
       </w:r>
     </w:p>
     <w:p>
-      <w:hyperlink w:history="1" r:id="rIduzz5az909etdkbws7e38z">
+      <w:hyperlink w:history="1" r:id="rIdsenw-lafxpmj6iftmv78_">
         <w:r>
           <w:rPr>
             <w:rStyle w:val="Hyperlink"/>
@@ -3140,7 +3140,7 @@
       </w:r>
     </w:p>
     <w:p>
-      <w:hyperlink w:history="1" r:id="rIdqcyiluqkjpui51b3qrku4">
+      <w:hyperlink w:history="1" r:id="rIdrp5jnceagkdv_qf1gpji_">
         <w:r>
           <w:rPr>
             <w:rStyle w:val="Hyperlink"/>
@@ -3158,7 +3158,7 @@
       </w:r>
     </w:p>
     <w:p>
-      <w:hyperlink w:history="1" r:id="rIdrfu5omxrzmccd_sis7hyj">
+      <w:hyperlink w:history="1" r:id="rIdaetpukx03xhtjz5uetnnt">
         <w:r>
           <w:rPr>
             <w:rStyle w:val="Hyperlink"/>
@@ -7027,7 +7027,7 @@
       </w:r>
     </w:p>
     <w:p>
-      <w:hyperlink w:history="1" r:id="rIdvtlfbnqx8l5k_nkpru6g9">
+      <w:hyperlink w:history="1" r:id="rIdlnon_qtvvcwa5mwt5yb5n">
         <w:r>
           <w:rPr>
             <w:rStyle w:val="Hyperlink"/>
@@ -7045,7 +7045,7 @@
       </w:r>
     </w:p>
     <w:p>
-      <w:hyperlink w:history="1" r:id="rId30stmoaxbxryghknewfzs">
+      <w:hyperlink w:history="1" r:id="rId3hntezw7snlul6stiadut">
         <w:r>
           <w:rPr>
             <w:rStyle w:val="Hyperlink"/>
@@ -7063,7 +7063,7 @@
       </w:r>
     </w:p>
     <w:p>
-      <w:hyperlink w:history="1" r:id="rIdefz7oshnx7rymzyazdcsb">
+      <w:hyperlink w:history="1" r:id="rIdvcwrafqz1x5zzpvnawx4y">
         <w:r>
           <w:rPr>
             <w:rStyle w:val="Hyperlink"/>
@@ -9117,7 +9117,7 @@
       </w:r>
     </w:p>
     <w:p>
-      <w:hyperlink w:history="1" r:id="rIdmdm4kixravm0wx3i5zdnr">
+      <w:hyperlink w:history="1" r:id="rIdfarj_usjy-w_5mddpcljn">
         <w:r>
           <w:rPr>
             <w:rStyle w:val="Hyperlink"/>
@@ -9135,7 +9135,7 @@
       </w:r>
     </w:p>
     <w:p>
-      <w:hyperlink w:history="1" r:id="rIdszdovhkdvvlmwkd6wible">
+      <w:hyperlink w:history="1" r:id="rIdyfae0htqknubmge3fgycb">
         <w:r>
           <w:rPr>
             <w:rStyle w:val="Hyperlink"/>
@@ -11888,7 +11888,7 @@
       </w:r>
     </w:p>
     <w:p>
-      <w:hyperlink w:history="1" r:id="rIdj-vrjiuu4dv6axnuetf7w">
+      <w:hyperlink w:history="1" r:id="rId0zgbe5o7gnx208rsp3xu2">
         <w:r>
           <w:rPr>
             <w:rStyle w:val="Hyperlink"/>

</xml_diff>